<commit_message>
Shorten report to 4 pages and remove university references
</commit_message>
<xml_diff>
--- a/assignment1/report/Assignment01_CastilloGarcera_Report.docx
+++ b/assignment1/report/Assignment01_CastilloGarcera_Report.docx
@@ -12,7 +12,7 @@
           <w:color w:val="1F4E79"/>
           <w:sz w:val="34"/>
         </w:rPr>
-        <w:t>How Matrix Size Affects the Speed and Memory of Basic Matrix Multiplication in Python, Java and C</w:t>
+        <w:t>Basic Matrix Multiplication in Python, Java and C: How Time and Memory Grow with n</w:t>
       </w:r>
     </w:p>
     <w:p>
@@ -36,7 +36,7 @@
         <w:rPr>
           <w:sz w:val="20"/>
         </w:rPr>
-        <w:t>Big Data · Individual Assignment 1 · Grado en Ciencia e Ingeniería de Datos · ULPGC · 2026-2027</w:t>
+        <w:t>Big Data, Individual Assignment 1, 2026-2027</w:t>
       </w:r>
     </w:p>
     <w:p>
@@ -48,7 +48,7 @@
         <w:rPr>
           <w:sz w:val="20"/>
         </w:rPr>
-        <w:t>Code and data: https://github.com/Pablo5250/matrix-multiplication (folder assignment1/)</w:t>
+        <w:t>Code, data and results: https://github.com/Pablo5250/matrix-multiplication (folder assignment1/)</w:t>
       </w:r>
     </w:p>
     <w:p/>
@@ -57,7 +57,7 @@
         <w:pStyle w:val="Heading1"/>
       </w:pPr>
       <w:r>
-        <w:t>Abstract</w:t>
+        <w:t>1. The problem</w:t>
       </w:r>
     </w:p>
     <w:p>
@@ -65,23 +65,7 @@
         <w:spacing w:after="80"/>
       </w:pPr>
       <w:r>
-        <w:t>We wrote the same basic matrix multiplication (three nested loops, n³ multiply-adds) in Python, Java and C, and measured time and memory for square matrices from n = 64 to n = 2048 on one computer (AMD Ryzen 9 5900X, Windows 11). All three programs read the same input files, and their results are identical bit by bit. Python was the slowest by far: 18 to 190 times slower than C, and its largest feasible size was n = 1024 (99 s per multiplication). The time grew close to n³ in all languages. A surprising result was that Java was faster than C at the tested sizes, which are all powers of two. A small extra experiment showed the reason: at n = 512 and n = 1024 the C program is about 6-7 times slower than at n - 1 or n + 1, because the column accesses all fall into the same few places of the CPU cache. At sizes that are not powers of two, C was the fastest. These conclusions only apply to these programs, settings and this machine.</w:t>
-      </w:r>
-    </w:p>
-    <w:p>
-      <w:pPr>
-        <w:pStyle w:val="Heading1"/>
-      </w:pPr>
-      <w:r>
-        <w:t>1. Introduction and objective</w:t>
-      </w:r>
-    </w:p>
-    <w:p>
-      <w:pPr>
-        <w:spacing w:after="80"/>
-      </w:pPr>
-      <w:r>
-        <w:t>Matrix multiplication is a core operation in data science (for example in linear regression and neural networks). Its simplest algorithm does n³ multiply-adds, so it becomes slow very quickly when n grows. In this first study we want to understand how much the programming language and its runtime change the cost of the same algorithm.</w:t>
+        <w:t>Matrix multiplication is one of the most used operations in data science: linear regression, neural networks and many other methods are, inside, millions of matrix products. To compute C = A × B for two n × n matrices, each element is c[i][j] = Σk a[i][k] × b[k][j]. The basic algorithm uses three nested loops (i, j, k), so it does n³ multiply-adds: its time complexity is O(n³) [1], while storing the three matrices needs only 3 × 8n² bytes. Doubling n means about 8 times more time but only 4 times more memory, so the cost grows very fast.</w:t>
       </w:r>
     </w:p>
     <w:p>
@@ -95,7 +79,7 @@
         <w:t>Research question.</w:t>
       </w:r>
       <w:r>
-        <w:t xml:space="preserve"> How does the matrix size n affect the runtime and the memory use of the same basic triple-loop matrix multiplication written in Python, Java and C, on one machine?</w:t>
+        <w:t xml:space="preserve"> How does the matrix size n affect the runtime and the memory use of the same basic triple-loop algorithm written in Python, Java and C, on one machine?</w:t>
       </w:r>
     </w:p>
     <w:p>
@@ -106,30 +90,18 @@
         <w:rPr>
           <w:b/>
         </w:rPr>
-        <w:t>Factor we change:</w:t>
+        <w:t>Hypotheses (before measuring):</w:t>
       </w:r>
       <w:r>
-        <w:t xml:space="preserve"> the matrix size n (and the language). </w:t>
-      </w:r>
-      <w:r>
-        <w:rPr>
-          <w:b/>
-        </w:rPr>
-        <w:t>What we measure:</w:t>
-      </w:r>
-      <w:r>
-        <w:t xml:space="preserve"> time of one multiplication and peak memory of the process.</w:t>
+        <w:t xml:space="preserve"> H1, time grows like n³ in the three languages; H2, Python is much slower because it is interpreted; H3, C is the fastest, with Java close; H4, C uses about the memory of the matrices, while Java and Python use more.</w:t>
       </w:r>
     </w:p>
     <w:p>
       <w:pPr>
-        <w:spacing w:after="80"/>
+        <w:pStyle w:val="Heading2"/>
       </w:pPr>
       <w:r>
-        <w:rPr>
-          <w:b/>
-        </w:rPr>
-        <w:t>Hypotheses (written before measuring):</w:t>
+        <w:t>How the comparison was made fair</w:t>
       </w:r>
     </w:p>
     <w:p>
@@ -138,7 +110,23 @@
         <w:spacing w:after="80"/>
       </w:pPr>
       <w:r>
-        <w:t>H1: in all three languages the time grows about like n³ (doubling n multiplies the time by about 8).</w:t>
+        <w:rPr>
+          <w:b/>
+        </w:rPr>
+        <w:t>Same algorithm:</w:t>
+      </w:r>
+      <w:r>
+        <w:t xml:space="preserve"> the three programs use the same i-j-k loops and 64-bit doubles, with no optimised library. Only the storage differs: a list of lists of float objects in Python, one array per row in Java (</w:t>
+      </w:r>
+      <w:r>
+        <w:rPr>
+          <w:rFonts w:ascii="Consolas" w:hAnsi="Consolas"/>
+          <w:sz w:val="19"/>
+        </w:rPr>
+        <w:t>double[][]</w:t>
+      </w:r>
+      <w:r>
+        <w:t>), and one contiguous block in C.</w:t>
       </w:r>
     </w:p>
     <w:p>
@@ -147,7 +135,13 @@
         <w:spacing w:after="80"/>
       </w:pPr>
       <w:r>
-        <w:t>H2: Python is much slower (around 50-100 times) than C and Java, because it is interpreted.</w:t>
+        <w:rPr>
+          <w:b/>
+        </w:rPr>
+        <w:t>Same inputs:</w:t>
+      </w:r>
+      <w:r>
+        <w:t xml:space="preserve"> A and B (uniform values in [0, 1), NumPy PCG64, seed 42 + n) are created once and saved to binary files that the three programs read, so they multiply exactly the same numbers.</w:t>
       </w:r>
     </w:p>
     <w:p>
@@ -156,7 +150,13 @@
         <w:spacing w:after="80"/>
       </w:pPr>
       <w:r>
-        <w:t>H3: C is the fastest and Java is close to C, because both run machine code.</w:t>
+        <w:rPr>
+          <w:b/>
+        </w:rPr>
+        <w:t>Correct before fast:</w:t>
+      </w:r>
+      <w:r>
+        <w:t xml:space="preserve"> unit tests (2×2 and 3×3 by hand, A × I = A, A × 0 = 0) and a comparison with NumPy for n = 16, 64, 128 (relative tolerance 10⁻⁹). All passed, and the three languages gave bit-identical results.</w:t>
       </w:r>
     </w:p>
     <w:p>
@@ -165,57 +165,37 @@
         <w:spacing w:after="80"/>
       </w:pPr>
       <w:r>
-        <w:t>H4: C uses about the memory of the three matrices (3 · 8n² bytes); Java and Python use more, because of the JVM and of Python objects.</w:t>
+        <w:rPr>
+          <w:b/>
+        </w:rPr>
+        <w:t>Timer:</w:t>
+      </w:r>
+      <w:r>
+        <w:t xml:space="preserve"> only the call multiply(A, B), including creating C; reading files is not timed. Each configuration runs in a new process: warm-up runs (3 in Java for the JIT compiler, 1 in C and Python), then 5 measured runs. We report the median and the IQR (spread of the middle half).</w:t>
       </w:r>
     </w:p>
     <w:p>
       <w:pPr>
-        <w:pStyle w:val="Heading1"/>
-      </w:pPr>
-      <w:r>
-        <w:t>2. Background</w:t>
-      </w:r>
-    </w:p>
-    <w:p>
-      <w:pPr>
+        <w:pStyle w:val="ListBullet"/>
         <w:spacing w:after="80"/>
       </w:pPr>
       <w:r>
         <w:rPr>
           <w:b/>
         </w:rPr>
-        <w:t>The algorithm.</w:t>
+        <w:t>Budget set before running:</w:t>
       </w:r>
       <w:r>
-        <w:t xml:space="preserve"> For C = A · B, each element is c[i][j] = Σk a[i][k] · b[k][j]. The basic algorithm uses three loops (i, j, k), so it does n³ multiplications and n³ additions: its time complexity is O(n³) [1]. The memory needed for the data is three n × n matrices; with 64-bit numbers that is 3 · 8n² bytes.</w:t>
+        <w:t xml:space="preserve"> 1200 s per configuration and 4 GB. A size predicted to exceed it is skipped, not invented. </w:t>
       </w:r>
-    </w:p>
-    <w:p>
-      <w:pPr>
-        <w:spacing w:after="80"/>
-      </w:pPr>
       <w:r>
         <w:rPr>
           <w:b/>
         </w:rPr>
-        <w:t>How each language runs the code.</w:t>
+        <w:t>Memory:</w:t>
       </w:r>
       <w:r>
-        <w:t xml:space="preserve"> C is compiled to machine code before running. Java is compiled to bytecode, and the JVM's JIT (just-in-time) compiler turns the hot methods into machine code while the program runs, so the first runs are slower (that is why we use warm-up runs) [4]. CPython is an interpreter: it runs each bytecode instruction one by one, and every number is a separate object in memory.</w:t>
-      </w:r>
-    </w:p>
-    <w:p>
-      <w:pPr>
-        <w:spacing w:after="80"/>
-      </w:pPr>
-      <w:r>
-        <w:rPr>
-          <w:b/>
-        </w:rPr>
-        <w:t>The cache.</w:t>
-      </w:r>
-      <w:r>
-        <w:t xml:space="preserve"> The CPU keeps recently used memory in small, fast caches (L1, L2, L3). Memory is moved in blocks of 64 bytes called cache lines. A cache is divided into sets, and each memory address can only go to one set, which holds a few lines (8 on our CPU's L1 and L2 [9]). If many addresses we use map to the same set, they keep removing each other even when the cache is not full. This is called a conflict miss, and it often happens when the distance between accesses is a power of two [2], [3].</w:t>
+        <w:t xml:space="preserve"> peak working set of the whole process, read from Windows every 10 ms with psutil.</w:t>
       </w:r>
     </w:p>
     <w:p>
@@ -228,796 +208,7 @@
           <w:i/>
           <w:sz w:val="18"/>
         </w:rPr>
-        <w:t>Table 1. Terms used in this report.</w:t>
-      </w:r>
-    </w:p>
-    <w:tbl>
-      <w:tblPr>
-        <w:tblStyle w:val="TableGrid"/>
-        <w:tblW w:type="auto" w:w="0"/>
-        <w:jc w:val="center"/>
-        <w:tblLook w:firstColumn="1" w:firstRow="1" w:lastColumn="0" w:lastRow="0" w:noHBand="0" w:noVBand="1" w:val="04A0"/>
-      </w:tblPr>
-      <w:tblGrid>
-        <w:gridCol w:w="4706"/>
-        <w:gridCol w:w="4706"/>
-      </w:tblGrid>
-      <w:tr>
-        <w:trPr>
-          <w:cantSplit/>
-        </w:trPr>
-        <w:tc>
-          <w:tcPr>
-            <w:tcW w:type="dxa" w:w="4706"/>
-            <w:shd w:val="clear" w:color="auto" w:fill="DCE6F1"/>
-          </w:tcPr>
-          <w:p>
-            <w:pPr>
-              <w:keepNext/>
-            </w:pPr>
-            <w:r/>
-            <w:r>
-              <w:rPr>
-                <w:b/>
-                <w:sz w:val="17"/>
-              </w:rPr>
-              <w:t>Term</w:t>
-            </w:r>
-          </w:p>
-        </w:tc>
-        <w:tc>
-          <w:tcPr>
-            <w:tcW w:type="dxa" w:w="4706"/>
-            <w:shd w:val="clear" w:color="auto" w:fill="DCE6F1"/>
-          </w:tcPr>
-          <w:p>
-            <w:pPr>
-              <w:keepNext/>
-            </w:pPr>
-            <w:r/>
-            <w:r>
-              <w:rPr>
-                <w:b/>
-                <w:sz w:val="17"/>
-              </w:rPr>
-              <w:t>Meaning in this report</w:t>
-            </w:r>
-          </w:p>
-        </w:tc>
-      </w:tr>
-      <w:tr>
-        <w:trPr>
-          <w:cantSplit/>
-        </w:trPr>
-        <w:tc>
-          <w:tcPr>
-            <w:tcW w:type="dxa" w:w="4706"/>
-          </w:tcPr>
-          <w:p>
-            <w:pPr>
-              <w:keepNext/>
-            </w:pPr>
-            <w:r/>
-            <w:r>
-              <w:rPr>
-                <w:sz w:val="17"/>
-              </w:rPr>
-              <w:t>n</w:t>
-            </w:r>
-          </w:p>
-        </w:tc>
-        <w:tc>
-          <w:tcPr>
-            <w:tcW w:type="dxa" w:w="4706"/>
-          </w:tcPr>
-          <w:p>
-            <w:pPr>
-              <w:keepNext/>
-            </w:pPr>
-            <w:r/>
-            <w:r>
-              <w:rPr>
-                <w:sz w:val="17"/>
-              </w:rPr>
-              <w:t>side of the square matrices (n × n)</w:t>
-            </w:r>
-          </w:p>
-        </w:tc>
-      </w:tr>
-      <w:tr>
-        <w:trPr>
-          <w:cantSplit/>
-        </w:trPr>
-        <w:tc>
-          <w:tcPr>
-            <w:tcW w:type="dxa" w:w="4706"/>
-          </w:tcPr>
-          <w:p>
-            <w:pPr>
-              <w:keepNext/>
-            </w:pPr>
-            <w:r/>
-            <w:r>
-              <w:rPr>
-                <w:sz w:val="17"/>
-              </w:rPr>
-              <w:t>Median</w:t>
-            </w:r>
-          </w:p>
-        </w:tc>
-        <w:tc>
-          <w:tcPr>
-            <w:tcW w:type="dxa" w:w="4706"/>
-          </w:tcPr>
-          <w:p>
-            <w:pPr>
-              <w:keepNext/>
-            </w:pPr>
-            <w:r/>
-            <w:r>
-              <w:rPr>
-                <w:sz w:val="17"/>
-              </w:rPr>
-              <w:t>middle value of the 5 measured runs; one slow run does not move it</w:t>
-            </w:r>
-          </w:p>
-        </w:tc>
-      </w:tr>
-      <w:tr>
-        <w:trPr>
-          <w:cantSplit/>
-        </w:trPr>
-        <w:tc>
-          <w:tcPr>
-            <w:tcW w:type="dxa" w:w="4706"/>
-          </w:tcPr>
-          <w:p>
-            <w:pPr>
-              <w:keepNext/>
-            </w:pPr>
-            <w:r/>
-            <w:r>
-              <w:rPr>
-                <w:sz w:val="17"/>
-              </w:rPr>
-              <w:t>IQR</w:t>
-            </w:r>
-          </w:p>
-        </w:tc>
-        <w:tc>
-          <w:tcPr>
-            <w:tcW w:type="dxa" w:w="4706"/>
-          </w:tcPr>
-          <w:p>
-            <w:pPr>
-              <w:keepNext/>
-            </w:pPr>
-            <w:r/>
-            <w:r>
-              <w:rPr>
-                <w:sz w:val="17"/>
-              </w:rPr>
-              <w:t>interquartile range = Q3 - Q1, the spread of the middle half of the runs</w:t>
-            </w:r>
-          </w:p>
-        </w:tc>
-      </w:tr>
-      <w:tr>
-        <w:trPr>
-          <w:cantSplit/>
-        </w:trPr>
-        <w:tc>
-          <w:tcPr>
-            <w:tcW w:type="dxa" w:w="4706"/>
-          </w:tcPr>
-          <w:p>
-            <w:pPr>
-              <w:keepNext/>
-            </w:pPr>
-            <w:r/>
-            <w:r>
-              <w:rPr>
-                <w:sz w:val="17"/>
-              </w:rPr>
-              <w:t>Warm-up run</w:t>
-            </w:r>
-          </w:p>
-        </w:tc>
-        <w:tc>
-          <w:tcPr>
-            <w:tcW w:type="dxa" w:w="4706"/>
-          </w:tcPr>
-          <w:p>
-            <w:pPr>
-              <w:keepNext/>
-            </w:pPr>
-            <w:r/>
-            <w:r>
-              <w:rPr>
-                <w:sz w:val="17"/>
-              </w:rPr>
-              <w:t>a run done before measuring and not counted (lets the JIT and caches settle)</w:t>
-            </w:r>
-          </w:p>
-        </w:tc>
-      </w:tr>
-      <w:tr>
-        <w:trPr>
-          <w:cantSplit/>
-        </w:trPr>
-        <w:tc>
-          <w:tcPr>
-            <w:tcW w:type="dxa" w:w="4706"/>
-          </w:tcPr>
-          <w:p>
-            <w:pPr>
-              <w:keepNext/>
-            </w:pPr>
-            <w:r/>
-            <w:r>
-              <w:rPr>
-                <w:sz w:val="17"/>
-              </w:rPr>
-              <w:t>ns / iteration</w:t>
-            </w:r>
-          </w:p>
-        </w:tc>
-        <w:tc>
-          <w:tcPr>
-            <w:tcW w:type="dxa" w:w="4706"/>
-          </w:tcPr>
-          <w:p>
-            <w:pPr>
-              <w:keepNext/>
-            </w:pPr>
-            <w:r/>
-            <w:r>
-              <w:rPr>
-                <w:sz w:val="17"/>
-              </w:rPr>
-              <w:t>median time / n³: the average cost of one c[i][j] += a[i][k]·b[k][j]</w:t>
-            </w:r>
-          </w:p>
-        </w:tc>
-      </w:tr>
-      <w:tr>
-        <w:trPr>
-          <w:cantSplit/>
-        </w:trPr>
-        <w:tc>
-          <w:tcPr>
-            <w:tcW w:type="dxa" w:w="4706"/>
-          </w:tcPr>
-          <w:p>
-            <w:pPr>
-              <w:keepNext/>
-            </w:pPr>
-            <w:r/>
-            <w:r>
-              <w:rPr>
-                <w:sz w:val="17"/>
-              </w:rPr>
-              <w:t>Peak memory</w:t>
-            </w:r>
-          </w:p>
-        </w:tc>
-        <w:tc>
-          <w:tcPr>
-            <w:tcW w:type="dxa" w:w="4706"/>
-          </w:tcPr>
-          <w:p>
-            <w:pPr>
-              <w:keepNext/>
-            </w:pPr>
-            <w:r/>
-            <w:r>
-              <w:rPr>
-                <w:sz w:val="17"/>
-              </w:rPr>
-              <w:t>largest amount of RAM the whole process used (working set on Windows)</w:t>
-            </w:r>
-          </w:p>
-        </w:tc>
-      </w:tr>
-      <w:tr>
-        <w:trPr>
-          <w:cantSplit/>
-        </w:trPr>
-        <w:tc>
-          <w:tcPr>
-            <w:tcW w:type="dxa" w:w="4706"/>
-          </w:tcPr>
-          <w:p>
-            <w:r/>
-            <w:r>
-              <w:rPr>
-                <w:sz w:val="17"/>
-              </w:rPr>
-              <w:t>Exponent b</w:t>
-            </w:r>
-          </w:p>
-        </w:tc>
-        <w:tc>
-          <w:tcPr>
-            <w:tcW w:type="dxa" w:w="4706"/>
-          </w:tcPr>
-          <w:p>
-            <w:r/>
-            <w:r>
-              <w:rPr>
-                <w:sz w:val="17"/>
-              </w:rPr>
-              <w:t>slope of the log-log fit time ≈ a · nᵇ; b = 3 means cubic growth</w:t>
-            </w:r>
-          </w:p>
-        </w:tc>
-      </w:tr>
-    </w:tbl>
-    <w:p>
-      <w:pPr>
-        <w:spacing w:after="0"/>
-      </w:pPr>
-    </w:p>
-    <w:p>
-      <w:pPr>
-        <w:pStyle w:val="Heading1"/>
-      </w:pPr>
-      <w:r>
-        <w:t>3. Methodology</w:t>
-      </w:r>
-    </w:p>
-    <w:p>
-      <w:pPr>
-        <w:pStyle w:val="Heading2"/>
-      </w:pPr>
-      <w:r>
-        <w:t>3.1 Implementations</w:t>
-      </w:r>
-    </w:p>
-    <w:p>
-      <w:pPr>
-        <w:spacing w:after="80"/>
-      </w:pPr>
-      <w:r>
-        <w:t>The three programs use the same loop order (i-j-k), the same numeric type (64-bit IEEE-754 double) and the same algorithm. No optimised library is used in the compared code. The only unavoidable difference is how each language stores a matrix:</w:t>
-      </w:r>
-    </w:p>
-    <w:p>
-      <w:pPr>
-        <w:keepNext/>
-        <w:spacing w:before="120" w:after="40"/>
-      </w:pPr>
-      <w:r>
-        <w:rPr>
-          <w:i/>
-          <w:sz w:val="18"/>
-        </w:rPr>
-        <w:t>Table 2. The three implementations. Code: python/matmul.py, java/src/MatMul.java, c/matmul.c.</w:t>
-      </w:r>
-    </w:p>
-    <w:tbl>
-      <w:tblPr>
-        <w:tblStyle w:val="TableGrid"/>
-        <w:tblW w:type="auto" w:w="0"/>
-        <w:jc w:val="center"/>
-        <w:tblLook w:firstColumn="1" w:firstRow="1" w:lastColumn="0" w:lastRow="0" w:noHBand="0" w:noVBand="1" w:val="04A0"/>
-      </w:tblPr>
-      <w:tblGrid>
-        <w:gridCol w:w="2353"/>
-        <w:gridCol w:w="2353"/>
-        <w:gridCol w:w="2353"/>
-        <w:gridCol w:w="2353"/>
-      </w:tblGrid>
-      <w:tr>
-        <w:trPr>
-          <w:cantSplit/>
-        </w:trPr>
-        <w:tc>
-          <w:tcPr>
-            <w:tcW w:type="dxa" w:w="2353"/>
-            <w:shd w:val="clear" w:color="auto" w:fill="DCE6F1"/>
-          </w:tcPr>
-          <w:p>
-            <w:pPr>
-              <w:keepNext/>
-            </w:pPr>
-            <w:r/>
-            <w:r>
-              <w:rPr>
-                <w:b/>
-                <w:sz w:val="17"/>
-              </w:rPr>
-            </w:r>
-          </w:p>
-        </w:tc>
-        <w:tc>
-          <w:tcPr>
-            <w:tcW w:type="dxa" w:w="2353"/>
-            <w:shd w:val="clear" w:color="auto" w:fill="DCE6F1"/>
-          </w:tcPr>
-          <w:p>
-            <w:pPr>
-              <w:keepNext/>
-            </w:pPr>
-            <w:r/>
-            <w:r>
-              <w:rPr>
-                <w:b/>
-                <w:sz w:val="17"/>
-              </w:rPr>
-              <w:t>Python</w:t>
-            </w:r>
-          </w:p>
-        </w:tc>
-        <w:tc>
-          <w:tcPr>
-            <w:tcW w:type="dxa" w:w="2353"/>
-            <w:shd w:val="clear" w:color="auto" w:fill="DCE6F1"/>
-          </w:tcPr>
-          <w:p>
-            <w:pPr>
-              <w:keepNext/>
-            </w:pPr>
-            <w:r/>
-            <w:r>
-              <w:rPr>
-                <w:b/>
-                <w:sz w:val="17"/>
-              </w:rPr>
-              <w:t>Java</w:t>
-            </w:r>
-          </w:p>
-        </w:tc>
-        <w:tc>
-          <w:tcPr>
-            <w:tcW w:type="dxa" w:w="2353"/>
-            <w:shd w:val="clear" w:color="auto" w:fill="DCE6F1"/>
-          </w:tcPr>
-          <w:p>
-            <w:pPr>
-              <w:keepNext/>
-            </w:pPr>
-            <w:r/>
-            <w:r>
-              <w:rPr>
-                <w:b/>
-                <w:sz w:val="17"/>
-              </w:rPr>
-              <w:t>C</w:t>
-            </w:r>
-          </w:p>
-        </w:tc>
-      </w:tr>
-      <w:tr>
-        <w:trPr>
-          <w:cantSplit/>
-        </w:trPr>
-        <w:tc>
-          <w:tcPr>
-            <w:tcW w:type="dxa" w:w="2353"/>
-          </w:tcPr>
-          <w:p>
-            <w:pPr>
-              <w:keepNext/>
-            </w:pPr>
-            <w:r/>
-            <w:r>
-              <w:rPr>
-                <w:sz w:val="17"/>
-              </w:rPr>
-              <w:t>Storage</w:t>
-            </w:r>
-          </w:p>
-        </w:tc>
-        <w:tc>
-          <w:tcPr>
-            <w:tcW w:type="dxa" w:w="2353"/>
-          </w:tcPr>
-          <w:p>
-            <w:pPr>
-              <w:keepNext/>
-            </w:pPr>
-            <w:r/>
-            <w:r>
-              <w:rPr>
-                <w:sz w:val="17"/>
-              </w:rPr>
-              <w:t>list of lists of float objects</w:t>
-            </w:r>
-          </w:p>
-        </w:tc>
-        <w:tc>
-          <w:tcPr>
-            <w:tcW w:type="dxa" w:w="2353"/>
-          </w:tcPr>
-          <w:p>
-            <w:pPr>
-              <w:keepNext/>
-            </w:pPr>
-            <w:r/>
-            <w:r>
-              <w:rPr>
-                <w:sz w:val="17"/>
-              </w:rPr>
-              <w:t>double[][] (one array object per row)</w:t>
-            </w:r>
-          </w:p>
-        </w:tc>
-        <w:tc>
-          <w:tcPr>
-            <w:tcW w:type="dxa" w:w="2353"/>
-          </w:tcPr>
-          <w:p>
-            <w:pPr>
-              <w:keepNext/>
-            </w:pPr>
-            <w:r/>
-            <w:r>
-              <w:rPr>
-                <w:sz w:val="17"/>
-              </w:rPr>
-              <w:t>one contiguous block of n·n doubles, row-major</w:t>
-            </w:r>
-          </w:p>
-        </w:tc>
-      </w:tr>
-      <w:tr>
-        <w:trPr>
-          <w:cantSplit/>
-        </w:trPr>
-        <w:tc>
-          <w:tcPr>
-            <w:tcW w:type="dxa" w:w="2353"/>
-          </w:tcPr>
-          <w:p>
-            <w:pPr>
-              <w:keepNext/>
-            </w:pPr>
-            <w:r/>
-            <w:r>
-              <w:rPr>
-                <w:sz w:val="17"/>
-              </w:rPr>
-              <w:t>Runs on</w:t>
-            </w:r>
-          </w:p>
-        </w:tc>
-        <w:tc>
-          <w:tcPr>
-            <w:tcW w:type="dxa" w:w="2353"/>
-          </w:tcPr>
-          <w:p>
-            <w:pPr>
-              <w:keepNext/>
-            </w:pPr>
-            <w:r/>
-            <w:r>
-              <w:rPr>
-                <w:sz w:val="17"/>
-              </w:rPr>
-              <w:t>CPython 3.14.3 interpreter</w:t>
-            </w:r>
-          </w:p>
-        </w:tc>
-        <w:tc>
-          <w:tcPr>
-            <w:tcW w:type="dxa" w:w="2353"/>
-          </w:tcPr>
-          <w:p>
-            <w:pPr>
-              <w:keepNext/>
-            </w:pPr>
-            <w:r/>
-            <w:r>
-              <w:rPr>
-                <w:sz w:val="17"/>
-              </w:rPr>
-              <w:t>OpenJDK 25.0.1 (JIT)</w:t>
-            </w:r>
-          </w:p>
-        </w:tc>
-        <w:tc>
-          <w:tcPr>
-            <w:tcW w:type="dxa" w:w="2353"/>
-          </w:tcPr>
-          <w:p>
-            <w:pPr>
-              <w:keepNext/>
-            </w:pPr>
-            <w:r/>
-            <w:r>
-              <w:rPr>
-                <w:sz w:val="17"/>
-              </w:rPr>
-              <w:t>gcc 16.2 -O2 -std=c11</w:t>
-            </w:r>
-          </w:p>
-        </w:tc>
-      </w:tr>
-      <w:tr>
-        <w:trPr>
-          <w:cantSplit/>
-        </w:trPr>
-        <w:tc>
-          <w:tcPr>
-            <w:tcW w:type="dxa" w:w="2353"/>
-          </w:tcPr>
-          <w:p>
-            <w:pPr>
-              <w:keepNext/>
-            </w:pPr>
-            <w:r/>
-            <w:r>
-              <w:rPr>
-                <w:sz w:val="17"/>
-              </w:rPr>
-              <w:t>Timer</w:t>
-            </w:r>
-          </w:p>
-        </w:tc>
-        <w:tc>
-          <w:tcPr>
-            <w:tcW w:type="dxa" w:w="2353"/>
-          </w:tcPr>
-          <w:p>
-            <w:pPr>
-              <w:keepNext/>
-            </w:pPr>
-            <w:r/>
-            <w:r>
-              <w:rPr>
-                <w:sz w:val="17"/>
-              </w:rPr>
-              <w:t>time.perf_counter_ns()</w:t>
-            </w:r>
-          </w:p>
-        </w:tc>
-        <w:tc>
-          <w:tcPr>
-            <w:tcW w:type="dxa" w:w="2353"/>
-          </w:tcPr>
-          <w:p>
-            <w:pPr>
-              <w:keepNext/>
-            </w:pPr>
-            <w:r/>
-            <w:r>
-              <w:rPr>
-                <w:sz w:val="17"/>
-              </w:rPr>
-              <w:t>System.nanoTime()</w:t>
-            </w:r>
-          </w:p>
-        </w:tc>
-        <w:tc>
-          <w:tcPr>
-            <w:tcW w:type="dxa" w:w="2353"/>
-          </w:tcPr>
-          <w:p>
-            <w:pPr>
-              <w:keepNext/>
-            </w:pPr>
-            <w:r/>
-            <w:r>
-              <w:rPr>
-                <w:sz w:val="17"/>
-              </w:rPr>
-              <w:t>QueryPerformanceCounter</w:t>
-            </w:r>
-          </w:p>
-        </w:tc>
-      </w:tr>
-      <w:tr>
-        <w:trPr>
-          <w:cantSplit/>
-        </w:trPr>
-        <w:tc>
-          <w:tcPr>
-            <w:tcW w:type="dxa" w:w="2353"/>
-          </w:tcPr>
-          <w:p>
-            <w:r/>
-            <w:r>
-              <w:rPr>
-                <w:sz w:val="17"/>
-              </w:rPr>
-              <w:t>Warm-up runs</w:t>
-            </w:r>
-          </w:p>
-        </w:tc>
-        <w:tc>
-          <w:tcPr>
-            <w:tcW w:type="dxa" w:w="2353"/>
-          </w:tcPr>
-          <w:p>
-            <w:pPr>
-              <w:jc w:val="right"/>
-            </w:pPr>
-            <w:r/>
-            <w:r>
-              <w:rPr>
-                <w:sz w:val="17"/>
-              </w:rPr>
-              <w:t>1</w:t>
-            </w:r>
-          </w:p>
-        </w:tc>
-        <w:tc>
-          <w:tcPr>
-            <w:tcW w:type="dxa" w:w="2353"/>
-          </w:tcPr>
-          <w:p>
-            <w:pPr>
-              <w:jc w:val="right"/>
-            </w:pPr>
-            <w:r/>
-            <w:r>
-              <w:rPr>
-                <w:sz w:val="17"/>
-              </w:rPr>
-              <w:t>3</w:t>
-            </w:r>
-          </w:p>
-        </w:tc>
-        <w:tc>
-          <w:tcPr>
-            <w:tcW w:type="dxa" w:w="2353"/>
-          </w:tcPr>
-          <w:p>
-            <w:pPr>
-              <w:jc w:val="right"/>
-            </w:pPr>
-            <w:r/>
-            <w:r>
-              <w:rPr>
-                <w:sz w:val="17"/>
-              </w:rPr>
-              <w:t>1</w:t>
-            </w:r>
-          </w:p>
-        </w:tc>
-      </w:tr>
-    </w:tbl>
-    <w:p>
-      <w:pPr>
-        <w:spacing w:after="0"/>
-      </w:pPr>
-    </w:p>
-    <w:p>
-      <w:pPr>
-        <w:pStyle w:val="Heading2"/>
-      </w:pPr>
-      <w:r>
-        <w:t>3.2 Inputs</w:t>
-      </w:r>
-    </w:p>
-    <w:p>
-      <w:pPr>
-        <w:spacing w:after="80"/>
-      </w:pPr>
-      <w:r>
-        <w:t>One Python script (data/generate_inputs.py) creates A and B for every size with NumPy's PCG64 generator, seed = 42 + n, uniform values in [0, 1). The matrices are saved as raw binary files (float64, little-endian, row-major). All three programs read these same files, so they multiply exactly the same numbers (random generators of different languages give different numbers). data/manifest.json stores the SHA-256 hash of every file.</w:t>
-      </w:r>
-    </w:p>
-    <w:p>
-      <w:pPr>
-        <w:pStyle w:val="Heading2"/>
-      </w:pPr>
-      <w:r>
-        <w:t>3.3 Environment</w:t>
-      </w:r>
-    </w:p>
-    <w:p>
-      <w:pPr>
-        <w:keepNext/>
-        <w:spacing w:before="120" w:after="40"/>
-      </w:pPr>
-      <w:r>
-        <w:rPr>
-          <w:i/>
-          <w:sz w:val="18"/>
-        </w:rPr>
-        <w:t>Table 3. Hardware and software (from results/environment.json).</w:t>
+        <w:t>Table 1. Test machine and software.</w:t>
       </w:r>
     </w:p>
     <w:tbl>
@@ -1388,136 +579,61 @@
     </w:p>
     <w:p>
       <w:pPr>
-        <w:spacing w:after="80"/>
+        <w:pStyle w:val="Heading1"/>
       </w:pPr>
       <w:r>
-        <w:t>All runs were done on the same computer, plugged in, with other heavy programs closed. The kernels are single-threaded.</w:t>
+        <w:t>2. Results</w:t>
       </w:r>
     </w:p>
     <w:p>
       <w:pPr>
-        <w:pStyle w:val="Heading2"/>
+        <w:jc w:val="center"/>
       </w:pPr>
       <w:r>
-        <w:t>3.4 Correctness checks (before measuring)</w:t>
+        <w:drawing>
+          <wp:inline xmlns:a="http://schemas.openxmlformats.org/drawingml/2006/main" xmlns:pic="http://schemas.openxmlformats.org/drawingml/2006/picture">
+            <wp:extent cx="4680000" cy="3008571"/>
+            <wp:docPr id="1" name="Picture 1"/>
+            <wp:cNvGraphicFramePr>
+              <a:graphicFrameLocks noChangeAspect="1"/>
+            </wp:cNvGraphicFramePr>
+            <a:graphic>
+              <a:graphicData uri="http://schemas.openxmlformats.org/drawingml/2006/picture">
+                <pic:pic>
+                  <pic:nvPicPr>
+                    <pic:cNvPr id="0" name="runtime_loglog.png"/>
+                    <pic:cNvPicPr/>
+                  </pic:nvPicPr>
+                  <pic:blipFill>
+                    <a:blip r:embed="rId9"/>
+                    <a:stretch>
+                      <a:fillRect/>
+                    </a:stretch>
+                  </pic:blipFill>
+                  <pic:spPr>
+                    <a:xfrm>
+                      <a:off x="0" y="0"/>
+                      <a:ext cx="4680000" cy="3008571"/>
+                    </a:xfrm>
+                    <a:prstGeom prst="rect"/>
+                  </pic:spPr>
+                </pic:pic>
+              </a:graphicData>
+            </a:graphic>
+          </wp:inline>
+        </w:drawing>
       </w:r>
     </w:p>
     <w:p>
       <w:pPr>
-        <w:pStyle w:val="ListBullet"/>
-        <w:spacing w:after="80"/>
-      </w:pPr>
-      <w:r>
-        <w:t>Unit tests in each language: known 2×2 and 3×3 products, A·I = A, I·A = A, A·0 = 0 and a 1×1 case.</w:t>
-      </w:r>
-    </w:p>
-    <w:p>
-      <w:pPr>
-        <w:pStyle w:val="ListBullet"/>
-        <w:spacing w:after="80"/>
-      </w:pPr>
-      <w:r>
-        <w:t>Comparison with a trusted reference, NumPy A @ B, for n = 16, 64 and 128, using relative tolerance 10⁻⁹ and absolute tolerance 10⁻¹². With positive inputs the expected rounding error is about n · 1.1·10⁻¹⁶ (below 10⁻¹³ here), so 10⁻⁹ leaves a safe margin and still catches any real bug. NumPy is only the reference, not a compared implementation.</w:t>
-      </w:r>
-    </w:p>
-    <w:p>
-      <w:pPr>
-        <w:pStyle w:val="ListBullet"/>
-        <w:spacing w:after="80"/>
-      </w:pPr>
-      <w:r>
-        <w:t>In every benchmark run the program computes the sum of all elements of C (checksum), which is saved and checked against NumPy. This also makes sure the result is really used.</w:t>
-      </w:r>
-    </w:p>
-    <w:p>
-      <w:pPr>
-        <w:pStyle w:val="Heading2"/>
-      </w:pPr>
-      <w:r>
-        <w:t>3.5 Measurement protocol</w:t>
-      </w:r>
-    </w:p>
-    <w:p>
-      <w:pPr>
-        <w:pStyle w:val="ListBullet"/>
-        <w:spacing w:after="80"/>
+        <w:jc w:val="center"/>
       </w:pPr>
       <w:r>
         <w:rPr>
-          <w:b/>
+          <w:i/>
+          <w:sz w:val="18"/>
         </w:rPr>
-        <w:t>What the timer includes:</w:t>
-      </w:r>
-      <w:r>
-        <w:t xml:space="preserve"> only the call multiply(A, B), including creating the output matrix C. Reading the input files is outside the timed part.</w:t>
-      </w:r>
-    </w:p>
-    <w:p>
-      <w:pPr>
-        <w:pStyle w:val="ListBullet"/>
-        <w:spacing w:after="80"/>
-      </w:pPr>
-      <w:r>
-        <w:rPr>
-          <w:b/>
-        </w:rPr>
-        <w:t>Repetitions:</w:t>
-      </w:r>
-      <w:r>
-        <w:t xml:space="preserve"> each (language, n) runs in a new process: warm-up runs (not counted) and then 5 measured runs. We report the median and the IQR. All raw times are kept in results/raw/times.csv; no value was removed.</w:t>
-      </w:r>
-    </w:p>
-    <w:p>
-      <w:pPr>
-        <w:pStyle w:val="ListBullet"/>
-        <w:spacing w:after="80"/>
-      </w:pPr>
-      <w:r>
-        <w:rPr>
-          <w:b/>
-        </w:rPr>
-        <w:t>Sizes:</w:t>
-      </w:r>
-      <w:r>
-        <w:t xml:space="preserve"> n = 64, 128, 256, 512, 1024, 2048 (each one doubles the previous).</w:t>
-      </w:r>
-    </w:p>
-    <w:p>
-      <w:pPr>
-        <w:pStyle w:val="ListBullet"/>
-        <w:spacing w:after="80"/>
-      </w:pPr>
-      <w:r>
-        <w:rPr>
-          <w:b/>
-        </w:rPr>
-        <w:t>Budgets (decided before running):</w:t>
-      </w:r>
-      <w:r>
-        <w:t xml:space="preserve"> 1200 s per configuration and 4096 MB of memory. Before each size, the runner predicts the time from the previous size assuming n³ growth; if the prediction is over the budget, the size is not started and is reported as skipped.</w:t>
-      </w:r>
-    </w:p>
-    <w:p>
-      <w:pPr>
-        <w:pStyle w:val="ListBullet"/>
-        <w:spacing w:after="80"/>
-      </w:pPr>
-      <w:r>
-        <w:rPr>
-          <w:b/>
-        </w:rPr>
-        <w:t>Memory:</w:t>
-      </w:r>
-      <w:r>
-        <w:t xml:space="preserve"> the runner reads the peak working set of the process from Windows every 10 ms (psutil [7]). This is the memory of the whole process (runtime + matrices), so we compare it with the size of the three matrices, 3 · 8n² bytes.</w:t>
-      </w:r>
-    </w:p>
-    <w:p>
-      <w:pPr>
-        <w:pStyle w:val="Heading2"/>
-      </w:pPr>
-      <w:r>
-        <w:t>3.6 Extra experiment: power-of-two sizes</w:t>
+        <w:t>Figure 1. Median time of one multiplication vs n (log-log axes). The dashed line grows like n³.</w:t>
       </w:r>
     </w:p>
     <w:p>
@@ -1525,23 +641,43 @@
         <w:spacing w:after="80"/>
       </w:pPr>
       <w:r>
-        <w:t>After seeing that Java was faster than C, we added a small separate experiment (scripts/extra_power_of_two.py): C and Java at n - 1, n and n + 1 for n = 256, 512 and 1024, with the same protocol. It is not part of the main comparison; it only tests one explanation.</w:t>
+        <w:t xml:space="preserve">All lines are almost parallel to the n³ line, so </w:t>
       </w:r>
-    </w:p>
-    <w:p>
-      <w:pPr>
-        <w:pStyle w:val="Heading1"/>
-      </w:pPr>
       <w:r>
-        <w:t>4. Results</w:t>
+        <w:rPr>
+          <w:b/>
+        </w:rPr>
+        <w:t>H1 holds</w:t>
       </w:r>
-    </w:p>
-    <w:p>
-      <w:pPr>
-        <w:pStyle w:val="Heading2"/>
-      </w:pPr>
       <w:r>
-        <w:t>4.1 Correctness</w:t>
+        <w:t xml:space="preserve">. Python is far above the others: 18 to 190 times slower than C (99 s at n = 1024). Python at n = 2048 was skipped, because the predicted time (about 4,700 s) was over the budget. </w:t>
+      </w:r>
+      <w:r>
+        <w:rPr>
+          <w:b/>
+        </w:rPr>
+        <w:t>H2 holds.</w:t>
+      </w:r>
+      <w:r>
+        <w:t xml:space="preserve"> The reason is the interpreter: each c[i][j] += a[i][k] × b[k][j] runs several bytecode instructions and creates a new float object, while C and Java run a few machine instructions. The surprise is that </w:t>
+      </w:r>
+      <w:r>
+        <w:rPr>
+          <w:b/>
+        </w:rPr>
+        <w:t>Java was faster than C</w:t>
+      </w:r>
+      <w:r>
+        <w:t xml:space="preserve"> at every n ≥ 128, so </w:t>
+      </w:r>
+      <w:r>
+        <w:rPr>
+          <w:b/>
+        </w:rPr>
+        <w:t>H3 fails</w:t>
+      </w:r>
+      <w:r>
+        <w:t xml:space="preserve"> at these sizes.</w:t>
       </w:r>
     </w:p>
     <w:p>
@@ -1554,421 +690,7 @@
           <w:i/>
           <w:sz w:val="18"/>
         </w:rPr>
-        <w:t>Table 4. Comparison with NumPy (results/validation.csv).</w:t>
-      </w:r>
-    </w:p>
-    <w:tbl>
-      <w:tblPr>
-        <w:tblStyle w:val="TableGrid"/>
-        <w:tblW w:type="auto" w:w="0"/>
-        <w:jc w:val="center"/>
-        <w:tblLook w:firstColumn="1" w:firstRow="1" w:lastColumn="0" w:lastRow="0" w:noHBand="0" w:noVBand="1" w:val="04A0"/>
-      </w:tblPr>
-      <w:tblGrid>
-        <w:gridCol w:w="1882"/>
-        <w:gridCol w:w="1882"/>
-        <w:gridCol w:w="1882"/>
-        <w:gridCol w:w="1882"/>
-        <w:gridCol w:w="1882"/>
-      </w:tblGrid>
-      <w:tr>
-        <w:trPr>
-          <w:cantSplit/>
-        </w:trPr>
-        <w:tc>
-          <w:tcPr>
-            <w:tcW w:type="dxa" w:w="1882"/>
-            <w:shd w:val="clear" w:color="auto" w:fill="DCE6F1"/>
-          </w:tcPr>
-          <w:p>
-            <w:pPr>
-              <w:keepNext/>
-            </w:pPr>
-            <w:r/>
-            <w:r>
-              <w:rPr>
-                <w:b/>
-                <w:sz w:val="17"/>
-              </w:rPr>
-              <w:t>n</w:t>
-            </w:r>
-          </w:p>
-        </w:tc>
-        <w:tc>
-          <w:tcPr>
-            <w:tcW w:type="dxa" w:w="1882"/>
-            <w:shd w:val="clear" w:color="auto" w:fill="DCE6F1"/>
-          </w:tcPr>
-          <w:p>
-            <w:pPr>
-              <w:keepNext/>
-            </w:pPr>
-            <w:r/>
-            <w:r>
-              <w:rPr>
-                <w:b/>
-                <w:sz w:val="17"/>
-              </w:rPr>
-              <w:t>Max abs. error</w:t>
-            </w:r>
-          </w:p>
-        </w:tc>
-        <w:tc>
-          <w:tcPr>
-            <w:tcW w:type="dxa" w:w="1882"/>
-            <w:shd w:val="clear" w:color="auto" w:fill="DCE6F1"/>
-          </w:tcPr>
-          <w:p>
-            <w:pPr>
-              <w:keepNext/>
-            </w:pPr>
-            <w:r/>
-            <w:r>
-              <w:rPr>
-                <w:b/>
-                <w:sz w:val="17"/>
-              </w:rPr>
-              <w:t>Max rel. error</w:t>
-            </w:r>
-          </w:p>
-        </w:tc>
-        <w:tc>
-          <w:tcPr>
-            <w:tcW w:type="dxa" w:w="1882"/>
-            <w:shd w:val="clear" w:color="auto" w:fill="DCE6F1"/>
-          </w:tcPr>
-          <w:p>
-            <w:pPr>
-              <w:keepNext/>
-            </w:pPr>
-            <w:r/>
-            <w:r>
-              <w:rPr>
-                <w:b/>
-                <w:sz w:val="17"/>
-              </w:rPr>
-              <w:t>All pass</w:t>
-            </w:r>
-          </w:p>
-        </w:tc>
-        <w:tc>
-          <w:tcPr>
-            <w:tcW w:type="dxa" w:w="1882"/>
-            <w:shd w:val="clear" w:color="auto" w:fill="DCE6F1"/>
-          </w:tcPr>
-          <w:p>
-            <w:pPr>
-              <w:keepNext/>
-            </w:pPr>
-            <w:r/>
-            <w:r>
-              <w:rPr>
-                <w:b/>
-                <w:sz w:val="17"/>
-              </w:rPr>
-              <w:t>C = Java = Python bit by bit</w:t>
-            </w:r>
-          </w:p>
-        </w:tc>
-      </w:tr>
-      <w:tr>
-        <w:trPr>
-          <w:cantSplit/>
-        </w:trPr>
-        <w:tc>
-          <w:tcPr>
-            <w:tcW w:type="dxa" w:w="1882"/>
-          </w:tcPr>
-          <w:p>
-            <w:pPr>
-              <w:keepNext/>
-            </w:pPr>
-            <w:r/>
-            <w:r>
-              <w:rPr>
-                <w:sz w:val="17"/>
-              </w:rPr>
-              <w:t>16</w:t>
-            </w:r>
-          </w:p>
-        </w:tc>
-        <w:tc>
-          <w:tcPr>
-            <w:tcW w:type="dxa" w:w="1882"/>
-          </w:tcPr>
-          <w:p>
-            <w:pPr>
-              <w:keepNext/>
-              <w:jc w:val="right"/>
-            </w:pPr>
-            <w:r/>
-            <w:r>
-              <w:rPr>
-                <w:sz w:val="17"/>
-              </w:rPr>
-              <w:t>1.8e-15</w:t>
-            </w:r>
-          </w:p>
-        </w:tc>
-        <w:tc>
-          <w:tcPr>
-            <w:tcW w:type="dxa" w:w="1882"/>
-          </w:tcPr>
-          <w:p>
-            <w:pPr>
-              <w:keepNext/>
-              <w:jc w:val="right"/>
-            </w:pPr>
-            <w:r/>
-            <w:r>
-              <w:rPr>
-                <w:sz w:val="17"/>
-              </w:rPr>
-              <w:t>3.9e-16</w:t>
-            </w:r>
-          </w:p>
-        </w:tc>
-        <w:tc>
-          <w:tcPr>
-            <w:tcW w:type="dxa" w:w="1882"/>
-          </w:tcPr>
-          <w:p>
-            <w:pPr>
-              <w:keepNext/>
-            </w:pPr>
-            <w:r/>
-            <w:r>
-              <w:rPr>
-                <w:sz w:val="17"/>
-              </w:rPr>
-              <w:t>yes</w:t>
-            </w:r>
-          </w:p>
-        </w:tc>
-        <w:tc>
-          <w:tcPr>
-            <w:tcW w:type="dxa" w:w="1882"/>
-          </w:tcPr>
-          <w:p>
-            <w:pPr>
-              <w:keepNext/>
-            </w:pPr>
-            <w:r/>
-            <w:r>
-              <w:rPr>
-                <w:sz w:val="17"/>
-              </w:rPr>
-              <w:t>yes</w:t>
-            </w:r>
-          </w:p>
-        </w:tc>
-      </w:tr>
-      <w:tr>
-        <w:trPr>
-          <w:cantSplit/>
-        </w:trPr>
-        <w:tc>
-          <w:tcPr>
-            <w:tcW w:type="dxa" w:w="1882"/>
-          </w:tcPr>
-          <w:p>
-            <w:pPr>
-              <w:keepNext/>
-            </w:pPr>
-            <w:r/>
-            <w:r>
-              <w:rPr>
-                <w:sz w:val="17"/>
-              </w:rPr>
-              <w:t>64</w:t>
-            </w:r>
-          </w:p>
-        </w:tc>
-        <w:tc>
-          <w:tcPr>
-            <w:tcW w:type="dxa" w:w="1882"/>
-          </w:tcPr>
-          <w:p>
-            <w:pPr>
-              <w:keepNext/>
-              <w:jc w:val="right"/>
-            </w:pPr>
-            <w:r/>
-            <w:r>
-              <w:rPr>
-                <w:sz w:val="17"/>
-              </w:rPr>
-              <w:t>7.1e-15</w:t>
-            </w:r>
-          </w:p>
-        </w:tc>
-        <w:tc>
-          <w:tcPr>
-            <w:tcW w:type="dxa" w:w="1882"/>
-          </w:tcPr>
-          <w:p>
-            <w:pPr>
-              <w:keepNext/>
-              <w:jc w:val="right"/>
-            </w:pPr>
-            <w:r/>
-            <w:r>
-              <w:rPr>
-                <w:sz w:val="17"/>
-              </w:rPr>
-              <w:t>4.4e-16</w:t>
-            </w:r>
-          </w:p>
-        </w:tc>
-        <w:tc>
-          <w:tcPr>
-            <w:tcW w:type="dxa" w:w="1882"/>
-          </w:tcPr>
-          <w:p>
-            <w:pPr>
-              <w:keepNext/>
-            </w:pPr>
-            <w:r/>
-            <w:r>
-              <w:rPr>
-                <w:sz w:val="17"/>
-              </w:rPr>
-              <w:t>yes</w:t>
-            </w:r>
-          </w:p>
-        </w:tc>
-        <w:tc>
-          <w:tcPr>
-            <w:tcW w:type="dxa" w:w="1882"/>
-          </w:tcPr>
-          <w:p>
-            <w:pPr>
-              <w:keepNext/>
-            </w:pPr>
-            <w:r/>
-            <w:r>
-              <w:rPr>
-                <w:sz w:val="17"/>
-              </w:rPr>
-              <w:t>yes</w:t>
-            </w:r>
-          </w:p>
-        </w:tc>
-      </w:tr>
-      <w:tr>
-        <w:trPr>
-          <w:cantSplit/>
-        </w:trPr>
-        <w:tc>
-          <w:tcPr>
-            <w:tcW w:type="dxa" w:w="1882"/>
-          </w:tcPr>
-          <w:p>
-            <w:r/>
-            <w:r>
-              <w:rPr>
-                <w:sz w:val="17"/>
-              </w:rPr>
-              <w:t>128</w:t>
-            </w:r>
-          </w:p>
-        </w:tc>
-        <w:tc>
-          <w:tcPr>
-            <w:tcW w:type="dxa" w:w="1882"/>
-          </w:tcPr>
-          <w:p>
-            <w:pPr>
-              <w:jc w:val="right"/>
-            </w:pPr>
-            <w:r/>
-            <w:r>
-              <w:rPr>
-                <w:sz w:val="17"/>
-              </w:rPr>
-              <w:t>2.1e-14</w:t>
-            </w:r>
-          </w:p>
-        </w:tc>
-        <w:tc>
-          <w:tcPr>
-            <w:tcW w:type="dxa" w:w="1882"/>
-          </w:tcPr>
-          <w:p>
-            <w:pPr>
-              <w:jc w:val="right"/>
-            </w:pPr>
-            <w:r/>
-            <w:r>
-              <w:rPr>
-                <w:sz w:val="17"/>
-              </w:rPr>
-              <w:t>6.3e-16</w:t>
-            </w:r>
-          </w:p>
-        </w:tc>
-        <w:tc>
-          <w:tcPr>
-            <w:tcW w:type="dxa" w:w="1882"/>
-          </w:tcPr>
-          <w:p>
-            <w:r/>
-            <w:r>
-              <w:rPr>
-                <w:sz w:val="17"/>
-              </w:rPr>
-              <w:t>yes</w:t>
-            </w:r>
-          </w:p>
-        </w:tc>
-        <w:tc>
-          <w:tcPr>
-            <w:tcW w:type="dxa" w:w="1882"/>
-          </w:tcPr>
-          <w:p>
-            <w:r/>
-            <w:r>
-              <w:rPr>
-                <w:sz w:val="17"/>
-              </w:rPr>
-              <w:t>yes</w:t>
-            </w:r>
-          </w:p>
-        </w:tc>
-      </w:tr>
-    </w:tbl>
-    <w:p>
-      <w:pPr>
-        <w:spacing w:after="0"/>
-      </w:pPr>
-    </w:p>
-    <w:p>
-      <w:pPr>
-        <w:spacing w:after="80"/>
-      </w:pPr>
-      <w:r>
-        <w:t>All unit tests passed, all results are inside the tolerance, and the three languages produce exactly the same bits, as expected, because they add the numbers in the same order. Every benchmark checksum also matched NumPy.</w:t>
-      </w:r>
-    </w:p>
-    <w:p>
-      <w:pPr>
-        <w:pStyle w:val="Heading2"/>
-      </w:pPr>
-      <w:r>
-        <w:t>4.2 Runtime</w:t>
-      </w:r>
-    </w:p>
-    <w:p>
-      <w:pPr>
-        <w:keepNext/>
-        <w:spacing w:before="120" w:after="40"/>
-      </w:pPr>
-      <w:r>
-        <w:rPr>
-          <w:i/>
-          <w:sz w:val="18"/>
-        </w:rPr>
-        <w:t>Table 5. Time of one multiplication: median and IQR of 5 measured runs. “× C” = median / median of C at the same n. Peak memory = peak working set of the process.</w:t>
+        <w:t>Table 2. Median and IQR of 5 measured runs per configuration. “ns / iteration” = median / n³; “× C” = median / median of C at the same n.</w:t>
       </w:r>
     </w:p>
     <w:tbl>
@@ -4664,8 +3386,8 @@
       <w:r>
         <w:drawing>
           <wp:inline xmlns:a="http://schemas.openxmlformats.org/drawingml/2006/main" xmlns:pic="http://schemas.openxmlformats.org/drawingml/2006/picture">
-            <wp:extent cx="5400000" cy="3471429"/>
-            <wp:docPr id="1" name="Picture 1"/>
+            <wp:extent cx="4680000" cy="2808000"/>
+            <wp:docPr id="2" name="Picture 2"/>
             <wp:cNvGraphicFramePr>
               <a:graphicFrameLocks noChangeAspect="1"/>
             </wp:cNvGraphicFramePr>
@@ -4673,11 +3395,11 @@
               <a:graphicData uri="http://schemas.openxmlformats.org/drawingml/2006/picture">
                 <pic:pic>
                   <pic:nvPicPr>
-                    <pic:cNvPr id="0" name="runtime_loglog.png"/>
+                    <pic:cNvPr id="0" name="extra_power_of_two.png"/>
                     <pic:cNvPicPr/>
                   </pic:nvPicPr>
                   <pic:blipFill>
-                    <a:blip r:embed="rId9"/>
+                    <a:blip r:embed="rId10"/>
                     <a:stretch>
                       <a:fillRect/>
                     </a:stretch>
@@ -4685,7 +3407,7 @@
                   <pic:spPr>
                     <a:xfrm>
                       <a:off x="0" y="0"/>
-                      <a:ext cx="5400000" cy="3471429"/>
+                      <a:ext cx="4680000" cy="2808000"/>
                     </a:xfrm>
                     <a:prstGeom prst="rect"/>
                   </pic:spPr>
@@ -4705,7 +3427,33 @@
           <w:i/>
           <w:sz w:val="18"/>
         </w:rPr>
-        <w:t>Figure 1. Median time vs n (both axes logarithmic). The dashed line grows like n³. Error bars (IQR) are very small.</w:t>
+        <w:t>Figure 2. Extra experiment: time per inner iteration at n − 1, n and n + 1. Dark bars are the powers of two.</w:t>
+      </w:r>
+    </w:p>
+    <w:p>
+      <w:pPr>
+        <w:spacing w:after="80"/>
+      </w:pPr>
+      <w:r>
+        <w:t xml:space="preserve">All the tested sizes are powers of two, so we ran C and Java again at n − 1 and n + 1. </w:t>
+      </w:r>
+      <w:r>
+        <w:rPr>
+          <w:b/>
+        </w:rPr>
+        <w:t>In C, n = 512 and 1024 are 6-7 times slower than their neighbours</w:t>
+      </w:r>
+      <w:r>
+        <w:t xml:space="preserve"> (4.6 ns vs 0.6-0.8 ns per iteration); Java hardly changes, and at the neighbour sizes C is the fastest. The cause is </w:t>
+      </w:r>
+      <w:r>
+        <w:rPr>
+          <w:b/>
+        </w:rPr>
+        <w:t>data locality</w:t>
+      </w:r>
+      <w:r>
+        <w:t xml:space="preserve"> [2], [3]: the inner loop reads a column of B. In C the rows are one block, so b[k][j] and b[k+1][j] are exactly 8n bytes apart (4096 bytes at n = 512). On this CPU those addresses all go to the same cache set, which holds only 8 lines [4], so the column is read again from slower memory every time (conflict misses). In Java each row is a separate object with a header, the distance is not a power of two, and the problem mostly disappears. It is not a bug: the code is correct and validated; it is the basic algorithm meeting the cache.</w:t>
       </w:r>
     </w:p>
     <w:p>
@@ -4715,8 +3463,8 @@
       <w:r>
         <w:drawing>
           <wp:inline xmlns:a="http://schemas.openxmlformats.org/drawingml/2006/main" xmlns:pic="http://schemas.openxmlformats.org/drawingml/2006/picture">
-            <wp:extent cx="5400000" cy="3471429"/>
-            <wp:docPr id="2" name="Picture 2"/>
+            <wp:extent cx="4680000" cy="3008571"/>
+            <wp:docPr id="3" name="Picture 3"/>
             <wp:cNvGraphicFramePr>
               <a:graphicFrameLocks noChangeAspect="1"/>
             </wp:cNvGraphicFramePr>
@@ -4724,11 +3472,11 @@
               <a:graphicData uri="http://schemas.openxmlformats.org/drawingml/2006/picture">
                 <pic:pic>
                   <pic:nvPicPr>
-                    <pic:cNvPr id="0" name="time_per_iteration.png"/>
+                    <pic:cNvPr id="0" name="memory.png"/>
                     <pic:cNvPicPr/>
                   </pic:nvPicPr>
                   <pic:blipFill>
-                    <a:blip r:embed="rId10"/>
+                    <a:blip r:embed="rId11"/>
                     <a:stretch>
                       <a:fillRect/>
                     </a:stretch>
@@ -4736,7 +3484,7 @@
                   <pic:spPr>
                     <a:xfrm>
                       <a:off x="0" y="0"/>
-                      <a:ext cx="5400000" cy="3471429"/>
+                      <a:ext cx="4680000" cy="3008571"/>
                     </a:xfrm>
                     <a:prstGeom prst="rect"/>
                   </pic:spPr>
@@ -4756,445 +3504,8 @@
           <w:i/>
           <w:sz w:val="18"/>
         </w:rPr>
-        <w:t>Figure 2. Time per inner iteration (median / n³). A flat line means perfect n³ growth.</w:t>
+        <w:t>Figure 3. Peak memory of the process vs n. The dashed line is the size of A, B and C as doubles (3 × 8n² bytes).</w:t>
       </w:r>
-    </w:p>
-    <w:p>
-      <w:pPr>
-        <w:keepNext/>
-        <w:spacing w:before="120" w:after="40"/>
-      </w:pPr>
-      <w:r>
-        <w:rPr>
-          <w:i/>
-          <w:sz w:val="18"/>
-        </w:rPr>
-        <w:t>Table 6. Fitted exponent b for n ≥ 256 (results/slopes.csv).</w:t>
-      </w:r>
-    </w:p>
-    <w:tbl>
-      <w:tblPr>
-        <w:tblStyle w:val="TableGrid"/>
-        <w:tblW w:type="auto" w:w="0"/>
-        <w:jc w:val="center"/>
-        <w:tblLook w:firstColumn="1" w:firstRow="1" w:lastColumn="0" w:lastRow="0" w:noHBand="0" w:noVBand="1" w:val="04A0"/>
-      </w:tblPr>
-      <w:tblGrid>
-        <w:gridCol w:w="3137"/>
-        <w:gridCol w:w="3137"/>
-        <w:gridCol w:w="3137"/>
-      </w:tblGrid>
-      <w:tr>
-        <w:trPr>
-          <w:cantSplit/>
-        </w:trPr>
-        <w:tc>
-          <w:tcPr>
-            <w:tcW w:type="dxa" w:w="3137"/>
-            <w:shd w:val="clear" w:color="auto" w:fill="DCE6F1"/>
-          </w:tcPr>
-          <w:p>
-            <w:pPr>
-              <w:keepNext/>
-            </w:pPr>
-            <w:r/>
-            <w:r>
-              <w:rPr>
-                <w:b/>
-                <w:sz w:val="17"/>
-              </w:rPr>
-              <w:t>Language</w:t>
-            </w:r>
-          </w:p>
-        </w:tc>
-        <w:tc>
-          <w:tcPr>
-            <w:tcW w:type="dxa" w:w="3137"/>
-            <w:shd w:val="clear" w:color="auto" w:fill="DCE6F1"/>
-          </w:tcPr>
-          <w:p>
-            <w:pPr>
-              <w:keepNext/>
-            </w:pPr>
-            <w:r/>
-            <w:r>
-              <w:rPr>
-                <w:b/>
-                <w:sz w:val="17"/>
-              </w:rPr>
-              <w:t>Sizes used for the fit</w:t>
-            </w:r>
-          </w:p>
-        </w:tc>
-        <w:tc>
-          <w:tcPr>
-            <w:tcW w:type="dxa" w:w="3137"/>
-            <w:shd w:val="clear" w:color="auto" w:fill="DCE6F1"/>
-          </w:tcPr>
-          <w:p>
-            <w:pPr>
-              <w:keepNext/>
-            </w:pPr>
-            <w:r/>
-            <w:r>
-              <w:rPr>
-                <w:b/>
-                <w:sz w:val="17"/>
-              </w:rPr>
-              <w:t>Exponent b (time ≈ a·nᵇ)</w:t>
-            </w:r>
-          </w:p>
-        </w:tc>
-      </w:tr>
-      <w:tr>
-        <w:trPr>
-          <w:cantSplit/>
-        </w:trPr>
-        <w:tc>
-          <w:tcPr>
-            <w:tcW w:type="dxa" w:w="3137"/>
-          </w:tcPr>
-          <w:p>
-            <w:pPr>
-              <w:keepNext/>
-            </w:pPr>
-            <w:r/>
-            <w:r>
-              <w:rPr>
-                <w:sz w:val="17"/>
-              </w:rPr>
-              <w:t>C</w:t>
-            </w:r>
-          </w:p>
-        </w:tc>
-        <w:tc>
-          <w:tcPr>
-            <w:tcW w:type="dxa" w:w="3137"/>
-          </w:tcPr>
-          <w:p>
-            <w:pPr>
-              <w:keepNext/>
-            </w:pPr>
-            <w:r/>
-            <w:r>
-              <w:rPr>
-                <w:sz w:val="17"/>
-              </w:rPr>
-              <w:t>256 512 1024 2048</w:t>
-            </w:r>
-          </w:p>
-        </w:tc>
-        <w:tc>
-          <w:tcPr>
-            <w:tcW w:type="dxa" w:w="3137"/>
-          </w:tcPr>
-          <w:p>
-            <w:pPr>
-              <w:keepNext/>
-              <w:jc w:val="right"/>
-            </w:pPr>
-            <w:r/>
-            <w:r>
-              <w:rPr>
-                <w:sz w:val="17"/>
-              </w:rPr>
-              <w:t>3.506</w:t>
-            </w:r>
-          </w:p>
-        </w:tc>
-      </w:tr>
-      <w:tr>
-        <w:trPr>
-          <w:cantSplit/>
-        </w:trPr>
-        <w:tc>
-          <w:tcPr>
-            <w:tcW w:type="dxa" w:w="3137"/>
-          </w:tcPr>
-          <w:p>
-            <w:pPr>
-              <w:keepNext/>
-            </w:pPr>
-            <w:r/>
-            <w:r>
-              <w:rPr>
-                <w:sz w:val="17"/>
-              </w:rPr>
-              <w:t>Java</w:t>
-            </w:r>
-          </w:p>
-        </w:tc>
-        <w:tc>
-          <w:tcPr>
-            <w:tcW w:type="dxa" w:w="3137"/>
-          </w:tcPr>
-          <w:p>
-            <w:pPr>
-              <w:keepNext/>
-            </w:pPr>
-            <w:r/>
-            <w:r>
-              <w:rPr>
-                <w:sz w:val="17"/>
-              </w:rPr>
-              <w:t>256 512 1024 2048</w:t>
-            </w:r>
-          </w:p>
-        </w:tc>
-        <w:tc>
-          <w:tcPr>
-            <w:tcW w:type="dxa" w:w="3137"/>
-          </w:tcPr>
-          <w:p>
-            <w:pPr>
-              <w:keepNext/>
-              <w:jc w:val="right"/>
-            </w:pPr>
-            <w:r/>
-            <w:r>
-              <w:rPr>
-                <w:sz w:val="17"/>
-              </w:rPr>
-              <w:t>3.804</w:t>
-            </w:r>
-          </w:p>
-        </w:tc>
-      </w:tr>
-      <w:tr>
-        <w:trPr>
-          <w:cantSplit/>
-        </w:trPr>
-        <w:tc>
-          <w:tcPr>
-            <w:tcW w:type="dxa" w:w="3137"/>
-          </w:tcPr>
-          <w:p>
-            <w:r/>
-            <w:r>
-              <w:rPr>
-                <w:sz w:val="17"/>
-              </w:rPr>
-              <w:t>Python</w:t>
-            </w:r>
-          </w:p>
-        </w:tc>
-        <w:tc>
-          <w:tcPr>
-            <w:tcW w:type="dxa" w:w="3137"/>
-          </w:tcPr>
-          <w:p>
-            <w:r/>
-            <w:r>
-              <w:rPr>
-                <w:sz w:val="17"/>
-              </w:rPr>
-              <w:t>256 512 1024</w:t>
-            </w:r>
-          </w:p>
-        </w:tc>
-        <w:tc>
-          <w:tcPr>
-            <w:tcW w:type="dxa" w:w="3137"/>
-          </w:tcPr>
-          <w:p>
-            <w:pPr>
-              <w:jc w:val="right"/>
-            </w:pPr>
-            <w:r/>
-            <w:r>
-              <w:rPr>
-                <w:sz w:val="17"/>
-              </w:rPr>
-              <w:t>3.182</w:t>
-            </w:r>
-          </w:p>
-        </w:tc>
-      </w:tr>
-    </w:tbl>
-    <w:p>
-      <w:pPr>
-        <w:spacing w:after="0"/>
-      </w:pPr>
-    </w:p>
-    <w:p>
-      <w:pPr>
-        <w:keepNext/>
-        <w:spacing w:before="120" w:after="40"/>
-      </w:pPr>
-      <w:r>
-        <w:rPr>
-          <w:i/>
-          <w:sz w:val="18"/>
-        </w:rPr>
-        <w:t>Table 7. Configurations that were not run.</w:t>
-      </w:r>
-    </w:p>
-    <w:tbl>
-      <w:tblPr>
-        <w:tblStyle w:val="TableGrid"/>
-        <w:tblW w:type="auto" w:w="0"/>
-        <w:jc w:val="center"/>
-        <w:tblLook w:firstColumn="1" w:firstRow="1" w:lastColumn="0" w:lastRow="0" w:noHBand="0" w:noVBand="1" w:val="04A0"/>
-      </w:tblPr>
-      <w:tblGrid>
-        <w:gridCol w:w="2353"/>
-        <w:gridCol w:w="2353"/>
-        <w:gridCol w:w="2353"/>
-        <w:gridCol w:w="2353"/>
-      </w:tblGrid>
-      <w:tr>
-        <w:trPr>
-          <w:cantSplit/>
-        </w:trPr>
-        <w:tc>
-          <w:tcPr>
-            <w:tcW w:type="dxa" w:w="2353"/>
-            <w:shd w:val="clear" w:color="auto" w:fill="DCE6F1"/>
-          </w:tcPr>
-          <w:p>
-            <w:pPr>
-              <w:keepNext/>
-            </w:pPr>
-            <w:r/>
-            <w:r>
-              <w:rPr>
-                <w:b/>
-                <w:sz w:val="17"/>
-              </w:rPr>
-              <w:t>Language</w:t>
-            </w:r>
-          </w:p>
-        </w:tc>
-        <w:tc>
-          <w:tcPr>
-            <w:tcW w:type="dxa" w:w="2353"/>
-            <w:shd w:val="clear" w:color="auto" w:fill="DCE6F1"/>
-          </w:tcPr>
-          <w:p>
-            <w:pPr>
-              <w:keepNext/>
-            </w:pPr>
-            <w:r/>
-            <w:r>
-              <w:rPr>
-                <w:b/>
-                <w:sz w:val="17"/>
-              </w:rPr>
-              <w:t>n</w:t>
-            </w:r>
-          </w:p>
-        </w:tc>
-        <w:tc>
-          <w:tcPr>
-            <w:tcW w:type="dxa" w:w="2353"/>
-            <w:shd w:val="clear" w:color="auto" w:fill="DCE6F1"/>
-          </w:tcPr>
-          <w:p>
-            <w:pPr>
-              <w:keepNext/>
-            </w:pPr>
-            <w:r/>
-            <w:r>
-              <w:rPr>
-                <w:b/>
-                <w:sz w:val="17"/>
-              </w:rPr>
-              <w:t>Status</w:t>
-            </w:r>
-          </w:p>
-        </w:tc>
-        <w:tc>
-          <w:tcPr>
-            <w:tcW w:type="dxa" w:w="2353"/>
-            <w:shd w:val="clear" w:color="auto" w:fill="DCE6F1"/>
-          </w:tcPr>
-          <w:p>
-            <w:pPr>
-              <w:keepNext/>
-            </w:pPr>
-            <w:r/>
-            <w:r>
-              <w:rPr>
-                <w:b/>
-                <w:sz w:val="17"/>
-              </w:rPr>
-              <w:t>Predicted total time</w:t>
-            </w:r>
-          </w:p>
-        </w:tc>
-      </w:tr>
-      <w:tr>
-        <w:trPr>
-          <w:cantSplit/>
-        </w:trPr>
-        <w:tc>
-          <w:tcPr>
-            <w:tcW w:type="dxa" w:w="2353"/>
-          </w:tcPr>
-          <w:p>
-            <w:r/>
-            <w:r>
-              <w:rPr>
-                <w:sz w:val="17"/>
-              </w:rPr>
-              <w:t>Python</w:t>
-            </w:r>
-          </w:p>
-        </w:tc>
-        <w:tc>
-          <w:tcPr>
-            <w:tcW w:type="dxa" w:w="2353"/>
-          </w:tcPr>
-          <w:p>
-            <w:pPr>
-              <w:jc w:val="right"/>
-            </w:pPr>
-            <w:r/>
-            <w:r>
-              <w:rPr>
-                <w:sz w:val="17"/>
-              </w:rPr>
-              <w:t>2048</w:t>
-            </w:r>
-          </w:p>
-        </w:tc>
-        <w:tc>
-          <w:tcPr>
-            <w:tcW w:type="dxa" w:w="2353"/>
-          </w:tcPr>
-          <w:p>
-            <w:r/>
-            <w:r>
-              <w:rPr>
-                <w:sz w:val="17"/>
-              </w:rPr>
-              <w:t>skipped predicted over budget</w:t>
-            </w:r>
-          </w:p>
-        </w:tc>
-        <w:tc>
-          <w:tcPr>
-            <w:tcW w:type="dxa" w:w="2353"/>
-          </w:tcPr>
-          <w:p>
-            <w:pPr>
-              <w:jc w:val="right"/>
-            </w:pPr>
-            <w:r/>
-            <w:r>
-              <w:rPr>
-                <w:sz w:val="17"/>
-              </w:rPr>
-              <w:t>4733 s</w:t>
-            </w:r>
-          </w:p>
-        </w:tc>
-      </w:tr>
-    </w:tbl>
-    <w:p>
-      <w:pPr>
-        <w:spacing w:after="0"/>
-      </w:pPr>
     </w:p>
     <w:p>
       <w:pPr>
@@ -5204,818 +3515,10 @@
         <w:rPr>
           <w:b/>
         </w:rPr>
-        <w:t>Limits.</w:t>
+        <w:t>H4 holds.</w:t>
       </w:r>
       <w:r>
-        <w:t xml:space="preserve"> The largest tested size was n = 2048 for C and Java and n = 1024 for Python. Python at n = 2048 was not started, because the predicted time (about 4,700 s) was over the 1200 s budget. There were no timeouts or memory failures.</w:t>
-      </w:r>
-    </w:p>
-    <w:p>
-      <w:pPr>
-        <w:pStyle w:val="Heading2"/>
-      </w:pPr>
-      <w:r>
-        <w:t>4.3 Power-of-two sizes</w:t>
-      </w:r>
-    </w:p>
-    <w:p>
-      <w:pPr>
-        <w:keepNext/>
-        <w:spacing w:before="120" w:after="40"/>
-      </w:pPr>
-      <w:r>
-        <w:rPr>
-          <w:i/>
-          <w:sz w:val="18"/>
-        </w:rPr>
-        <w:t>Table 8. ns per inner iteration at n - 1, n and n + 1 (results/extra_power_of_two.csv).</w:t>
-      </w:r>
-    </w:p>
-    <w:tbl>
-      <w:tblPr>
-        <w:tblStyle w:val="TableGrid"/>
-        <w:tblW w:type="auto" w:w="0"/>
-        <w:jc w:val="center"/>
-        <w:tblLook w:firstColumn="1" w:firstRow="1" w:lastColumn="0" w:lastRow="0" w:noHBand="0" w:noVBand="1" w:val="04A0"/>
-      </w:tblPr>
-      <w:tblGrid>
-        <w:gridCol w:w="1882"/>
-        <w:gridCol w:w="1882"/>
-        <w:gridCol w:w="1882"/>
-        <w:gridCol w:w="1882"/>
-        <w:gridCol w:w="1882"/>
-      </w:tblGrid>
-      <w:tr>
-        <w:trPr>
-          <w:cantSplit/>
-        </w:trPr>
-        <w:tc>
-          <w:tcPr>
-            <w:tcW w:type="dxa" w:w="1882"/>
-            <w:shd w:val="clear" w:color="auto" w:fill="DCE6F1"/>
-          </w:tcPr>
-          <w:p>
-            <w:pPr>
-              <w:keepNext/>
-            </w:pPr>
-            <w:r/>
-            <w:r>
-              <w:rPr>
-                <w:b/>
-                <w:sz w:val="17"/>
-              </w:rPr>
-              <w:t>Language</w:t>
-            </w:r>
-          </w:p>
-        </w:tc>
-        <w:tc>
-          <w:tcPr>
-            <w:tcW w:type="dxa" w:w="1882"/>
-            <w:shd w:val="clear" w:color="auto" w:fill="DCE6F1"/>
-          </w:tcPr>
-          <w:p>
-            <w:pPr>
-              <w:keepNext/>
-            </w:pPr>
-            <w:r/>
-            <w:r>
-              <w:rPr>
-                <w:b/>
-                <w:sz w:val="17"/>
-              </w:rPr>
-              <w:t>n</w:t>
-            </w:r>
-          </w:p>
-        </w:tc>
-        <w:tc>
-          <w:tcPr>
-            <w:tcW w:type="dxa" w:w="1882"/>
-            <w:shd w:val="clear" w:color="auto" w:fill="DCE6F1"/>
-          </w:tcPr>
-          <w:p>
-            <w:pPr>
-              <w:keepNext/>
-            </w:pPr>
-            <w:r/>
-            <w:r>
-              <w:rPr>
-                <w:b/>
-                <w:sz w:val="17"/>
-              </w:rPr>
-              <w:t>n - 1</w:t>
-            </w:r>
-          </w:p>
-        </w:tc>
-        <w:tc>
-          <w:tcPr>
-            <w:tcW w:type="dxa" w:w="1882"/>
-            <w:shd w:val="clear" w:color="auto" w:fill="DCE6F1"/>
-          </w:tcPr>
-          <w:p>
-            <w:pPr>
-              <w:keepNext/>
-            </w:pPr>
-            <w:r/>
-            <w:r>
-              <w:rPr>
-                <w:b/>
-                <w:sz w:val="17"/>
-              </w:rPr>
-              <w:t>n (power of 2)</w:t>
-            </w:r>
-          </w:p>
-        </w:tc>
-        <w:tc>
-          <w:tcPr>
-            <w:tcW w:type="dxa" w:w="1882"/>
-            <w:shd w:val="clear" w:color="auto" w:fill="DCE6F1"/>
-          </w:tcPr>
-          <w:p>
-            <w:pPr>
-              <w:keepNext/>
-            </w:pPr>
-            <w:r/>
-            <w:r>
-              <w:rPr>
-                <w:b/>
-                <w:sz w:val="17"/>
-              </w:rPr>
-              <w:t>n + 1</w:t>
-            </w:r>
-          </w:p>
-        </w:tc>
-      </w:tr>
-      <w:tr>
-        <w:trPr>
-          <w:cantSplit/>
-        </w:trPr>
-        <w:tc>
-          <w:tcPr>
-            <w:tcW w:type="dxa" w:w="1882"/>
-          </w:tcPr>
-          <w:p>
-            <w:pPr>
-              <w:keepNext/>
-            </w:pPr>
-            <w:r/>
-            <w:r>
-              <w:rPr>
-                <w:sz w:val="17"/>
-              </w:rPr>
-              <w:t>C</w:t>
-            </w:r>
-          </w:p>
-        </w:tc>
-        <w:tc>
-          <w:tcPr>
-            <w:tcW w:type="dxa" w:w="1882"/>
-          </w:tcPr>
-          <w:p>
-            <w:pPr>
-              <w:keepNext/>
-              <w:jc w:val="right"/>
-            </w:pPr>
-            <w:r/>
-            <w:r>
-              <w:rPr>
-                <w:sz w:val="17"/>
-              </w:rPr>
-              <w:t>256</w:t>
-            </w:r>
-          </w:p>
-        </w:tc>
-        <w:tc>
-          <w:tcPr>
-            <w:tcW w:type="dxa" w:w="1882"/>
-          </w:tcPr>
-          <w:p>
-            <w:pPr>
-              <w:keepNext/>
-              <w:jc w:val="right"/>
-            </w:pPr>
-            <w:r/>
-            <w:r>
-              <w:rPr>
-                <w:sz w:val="17"/>
-              </w:rPr>
-              <w:t>0.59</w:t>
-            </w:r>
-          </w:p>
-        </w:tc>
-        <w:tc>
-          <w:tcPr>
-            <w:tcW w:type="dxa" w:w="1882"/>
-          </w:tcPr>
-          <w:p>
-            <w:pPr>
-              <w:keepNext/>
-              <w:jc w:val="right"/>
-            </w:pPr>
-            <w:r/>
-            <w:r>
-              <w:rPr>
-                <w:sz w:val="17"/>
-              </w:rPr>
-              <w:t>1.32</w:t>
-            </w:r>
-          </w:p>
-        </w:tc>
-        <w:tc>
-          <w:tcPr>
-            <w:tcW w:type="dxa" w:w="1882"/>
-          </w:tcPr>
-          <w:p>
-            <w:pPr>
-              <w:keepNext/>
-              <w:jc w:val="right"/>
-            </w:pPr>
-            <w:r/>
-            <w:r>
-              <w:rPr>
-                <w:sz w:val="17"/>
-              </w:rPr>
-              <w:t>0.61</w:t>
-            </w:r>
-          </w:p>
-        </w:tc>
-      </w:tr>
-      <w:tr>
-        <w:trPr>
-          <w:cantSplit/>
-        </w:trPr>
-        <w:tc>
-          <w:tcPr>
-            <w:tcW w:type="dxa" w:w="1882"/>
-          </w:tcPr>
-          <w:p>
-            <w:pPr>
-              <w:keepNext/>
-            </w:pPr>
-            <w:r/>
-            <w:r>
-              <w:rPr>
-                <w:sz w:val="17"/>
-              </w:rPr>
-              <w:t>C</w:t>
-            </w:r>
-          </w:p>
-        </w:tc>
-        <w:tc>
-          <w:tcPr>
-            <w:tcW w:type="dxa" w:w="1882"/>
-          </w:tcPr>
-          <w:p>
-            <w:pPr>
-              <w:keepNext/>
-              <w:jc w:val="right"/>
-            </w:pPr>
-            <w:r/>
-            <w:r>
-              <w:rPr>
-                <w:sz w:val="17"/>
-              </w:rPr>
-              <w:t>512</w:t>
-            </w:r>
-          </w:p>
-        </w:tc>
-        <w:tc>
-          <w:tcPr>
-            <w:tcW w:type="dxa" w:w="1882"/>
-          </w:tcPr>
-          <w:p>
-            <w:pPr>
-              <w:keepNext/>
-              <w:jc w:val="right"/>
-            </w:pPr>
-            <w:r/>
-            <w:r>
-              <w:rPr>
-                <w:sz w:val="17"/>
-              </w:rPr>
-              <w:t>0.64</w:t>
-            </w:r>
-          </w:p>
-        </w:tc>
-        <w:tc>
-          <w:tcPr>
-            <w:tcW w:type="dxa" w:w="1882"/>
-          </w:tcPr>
-          <w:p>
-            <w:pPr>
-              <w:keepNext/>
-              <w:jc w:val="right"/>
-            </w:pPr>
-            <w:r/>
-            <w:r>
-              <w:rPr>
-                <w:sz w:val="17"/>
-              </w:rPr>
-              <w:t>4.64</w:t>
-            </w:r>
-          </w:p>
-        </w:tc>
-        <w:tc>
-          <w:tcPr>
-            <w:tcW w:type="dxa" w:w="1882"/>
-          </w:tcPr>
-          <w:p>
-            <w:pPr>
-              <w:keepNext/>
-              <w:jc w:val="right"/>
-            </w:pPr>
-            <w:r/>
-            <w:r>
-              <w:rPr>
-                <w:sz w:val="17"/>
-              </w:rPr>
-              <w:t>0.75</w:t>
-            </w:r>
-          </w:p>
-        </w:tc>
-      </w:tr>
-      <w:tr>
-        <w:trPr>
-          <w:cantSplit/>
-        </w:trPr>
-        <w:tc>
-          <w:tcPr>
-            <w:tcW w:type="dxa" w:w="1882"/>
-          </w:tcPr>
-          <w:p>
-            <w:pPr>
-              <w:keepNext/>
-            </w:pPr>
-            <w:r/>
-            <w:r>
-              <w:rPr>
-                <w:sz w:val="17"/>
-              </w:rPr>
-              <w:t>C</w:t>
-            </w:r>
-          </w:p>
-        </w:tc>
-        <w:tc>
-          <w:tcPr>
-            <w:tcW w:type="dxa" w:w="1882"/>
-          </w:tcPr>
-          <w:p>
-            <w:pPr>
-              <w:keepNext/>
-              <w:jc w:val="right"/>
-            </w:pPr>
-            <w:r/>
-            <w:r>
-              <w:rPr>
-                <w:sz w:val="17"/>
-              </w:rPr>
-              <w:t>1024</w:t>
-            </w:r>
-          </w:p>
-        </w:tc>
-        <w:tc>
-          <w:tcPr>
-            <w:tcW w:type="dxa" w:w="1882"/>
-          </w:tcPr>
-          <w:p>
-            <w:pPr>
-              <w:keepNext/>
-              <w:jc w:val="right"/>
-            </w:pPr>
-            <w:r/>
-            <w:r>
-              <w:rPr>
-                <w:sz w:val="17"/>
-              </w:rPr>
-              <w:t>0.70</w:t>
-            </w:r>
-          </w:p>
-        </w:tc>
-        <w:tc>
-          <w:tcPr>
-            <w:tcW w:type="dxa" w:w="1882"/>
-          </w:tcPr>
-          <w:p>
-            <w:pPr>
-              <w:keepNext/>
-              <w:jc w:val="right"/>
-            </w:pPr>
-            <w:r/>
-            <w:r>
-              <w:rPr>
-                <w:sz w:val="17"/>
-              </w:rPr>
-              <w:t>4.38</w:t>
-            </w:r>
-          </w:p>
-        </w:tc>
-        <w:tc>
-          <w:tcPr>
-            <w:tcW w:type="dxa" w:w="1882"/>
-          </w:tcPr>
-          <w:p>
-            <w:pPr>
-              <w:keepNext/>
-              <w:jc w:val="right"/>
-            </w:pPr>
-            <w:r/>
-            <w:r>
-              <w:rPr>
-                <w:sz w:val="17"/>
-              </w:rPr>
-              <w:t>0.70</w:t>
-            </w:r>
-          </w:p>
-        </w:tc>
-      </w:tr>
-      <w:tr>
-        <w:trPr>
-          <w:cantSplit/>
-        </w:trPr>
-        <w:tc>
-          <w:tcPr>
-            <w:tcW w:type="dxa" w:w="1882"/>
-          </w:tcPr>
-          <w:p>
-            <w:pPr>
-              <w:keepNext/>
-            </w:pPr>
-            <w:r/>
-            <w:r>
-              <w:rPr>
-                <w:sz w:val="17"/>
-              </w:rPr>
-              <w:t>Java</w:t>
-            </w:r>
-          </w:p>
-        </w:tc>
-        <w:tc>
-          <w:tcPr>
-            <w:tcW w:type="dxa" w:w="1882"/>
-          </w:tcPr>
-          <w:p>
-            <w:pPr>
-              <w:keepNext/>
-              <w:jc w:val="right"/>
-            </w:pPr>
-            <w:r/>
-            <w:r>
-              <w:rPr>
-                <w:sz w:val="17"/>
-              </w:rPr>
-              <w:t>256</w:t>
-            </w:r>
-          </w:p>
-        </w:tc>
-        <w:tc>
-          <w:tcPr>
-            <w:tcW w:type="dxa" w:w="1882"/>
-          </w:tcPr>
-          <w:p>
-            <w:pPr>
-              <w:keepNext/>
-              <w:jc w:val="right"/>
-            </w:pPr>
-            <w:r/>
-            <w:r>
-              <w:rPr>
-                <w:sz w:val="17"/>
-              </w:rPr>
-              <w:t>0.93</w:t>
-            </w:r>
-          </w:p>
-        </w:tc>
-        <w:tc>
-          <w:tcPr>
-            <w:tcW w:type="dxa" w:w="1882"/>
-          </w:tcPr>
-          <w:p>
-            <w:pPr>
-              <w:keepNext/>
-              <w:jc w:val="right"/>
-            </w:pPr>
-            <w:r/>
-            <w:r>
-              <w:rPr>
-                <w:sz w:val="17"/>
-              </w:rPr>
-              <w:t>0.81</w:t>
-            </w:r>
-          </w:p>
-        </w:tc>
-        <w:tc>
-          <w:tcPr>
-            <w:tcW w:type="dxa" w:w="1882"/>
-          </w:tcPr>
-          <w:p>
-            <w:pPr>
-              <w:keepNext/>
-              <w:jc w:val="right"/>
-            </w:pPr>
-            <w:r/>
-            <w:r>
-              <w:rPr>
-                <w:sz w:val="17"/>
-              </w:rPr>
-              <w:t>0.70</w:t>
-            </w:r>
-          </w:p>
-        </w:tc>
-      </w:tr>
-      <w:tr>
-        <w:trPr>
-          <w:cantSplit/>
-        </w:trPr>
-        <w:tc>
-          <w:tcPr>
-            <w:tcW w:type="dxa" w:w="1882"/>
-          </w:tcPr>
-          <w:p>
-            <w:pPr>
-              <w:keepNext/>
-            </w:pPr>
-            <w:r/>
-            <w:r>
-              <w:rPr>
-                <w:sz w:val="17"/>
-              </w:rPr>
-              <w:t>Java</w:t>
-            </w:r>
-          </w:p>
-        </w:tc>
-        <w:tc>
-          <w:tcPr>
-            <w:tcW w:type="dxa" w:w="1882"/>
-          </w:tcPr>
-          <w:p>
-            <w:pPr>
-              <w:keepNext/>
-              <w:jc w:val="right"/>
-            </w:pPr>
-            <w:r/>
-            <w:r>
-              <w:rPr>
-                <w:sz w:val="17"/>
-              </w:rPr>
-              <w:t>512</w:t>
-            </w:r>
-          </w:p>
-        </w:tc>
-        <w:tc>
-          <w:tcPr>
-            <w:tcW w:type="dxa" w:w="1882"/>
-          </w:tcPr>
-          <w:p>
-            <w:pPr>
-              <w:keepNext/>
-              <w:jc w:val="right"/>
-            </w:pPr>
-            <w:r/>
-            <w:r>
-              <w:rPr>
-                <w:sz w:val="17"/>
-              </w:rPr>
-              <w:t>1.11</w:t>
-            </w:r>
-          </w:p>
-        </w:tc>
-        <w:tc>
-          <w:tcPr>
-            <w:tcW w:type="dxa" w:w="1882"/>
-          </w:tcPr>
-          <w:p>
-            <w:pPr>
-              <w:keepNext/>
-              <w:jc w:val="right"/>
-            </w:pPr>
-            <w:r/>
-            <w:r>
-              <w:rPr>
-                <w:sz w:val="17"/>
-              </w:rPr>
-              <w:t>1.19</w:t>
-            </w:r>
-          </w:p>
-        </w:tc>
-        <w:tc>
-          <w:tcPr>
-            <w:tcW w:type="dxa" w:w="1882"/>
-          </w:tcPr>
-          <w:p>
-            <w:pPr>
-              <w:keepNext/>
-              <w:jc w:val="right"/>
-            </w:pPr>
-            <w:r/>
-            <w:r>
-              <w:rPr>
-                <w:sz w:val="17"/>
-              </w:rPr>
-              <w:t>1.03</w:t>
-            </w:r>
-          </w:p>
-        </w:tc>
-      </w:tr>
-      <w:tr>
-        <w:trPr>
-          <w:cantSplit/>
-        </w:trPr>
-        <w:tc>
-          <w:tcPr>
-            <w:tcW w:type="dxa" w:w="1882"/>
-          </w:tcPr>
-          <w:p>
-            <w:r/>
-            <w:r>
-              <w:rPr>
-                <w:sz w:val="17"/>
-              </w:rPr>
-              <w:t>Java</w:t>
-            </w:r>
-          </w:p>
-        </w:tc>
-        <w:tc>
-          <w:tcPr>
-            <w:tcW w:type="dxa" w:w="1882"/>
-          </w:tcPr>
-          <w:p>
-            <w:pPr>
-              <w:jc w:val="right"/>
-            </w:pPr>
-            <w:r/>
-            <w:r>
-              <w:rPr>
-                <w:sz w:val="17"/>
-              </w:rPr>
-              <w:t>1024</w:t>
-            </w:r>
-          </w:p>
-        </w:tc>
-        <w:tc>
-          <w:tcPr>
-            <w:tcW w:type="dxa" w:w="1882"/>
-          </w:tcPr>
-          <w:p>
-            <w:pPr>
-              <w:jc w:val="right"/>
-            </w:pPr>
-            <w:r/>
-            <w:r>
-              <w:rPr>
-                <w:sz w:val="17"/>
-              </w:rPr>
-              <w:t>1.88</w:t>
-            </w:r>
-          </w:p>
-        </w:tc>
-        <w:tc>
-          <w:tcPr>
-            <w:tcW w:type="dxa" w:w="1882"/>
-          </w:tcPr>
-          <w:p>
-            <w:pPr>
-              <w:jc w:val="right"/>
-            </w:pPr>
-            <w:r/>
-            <w:r>
-              <w:rPr>
-                <w:sz w:val="17"/>
-              </w:rPr>
-              <w:t>1.79</w:t>
-            </w:r>
-          </w:p>
-        </w:tc>
-        <w:tc>
-          <w:tcPr>
-            <w:tcW w:type="dxa" w:w="1882"/>
-          </w:tcPr>
-          <w:p>
-            <w:pPr>
-              <w:jc w:val="right"/>
-            </w:pPr>
-            <w:r/>
-            <w:r>
-              <w:rPr>
-                <w:sz w:val="17"/>
-              </w:rPr>
-              <w:t>1.50</w:t>
-            </w:r>
-          </w:p>
-        </w:tc>
-      </w:tr>
-    </w:tbl>
-    <w:p>
-      <w:pPr>
-        <w:spacing w:after="0"/>
-      </w:pPr>
-    </w:p>
-    <w:p>
-      <w:pPr>
-        <w:jc w:val="center"/>
-      </w:pPr>
-      <w:r>
-        <w:drawing>
-          <wp:inline xmlns:a="http://schemas.openxmlformats.org/drawingml/2006/main" xmlns:pic="http://schemas.openxmlformats.org/drawingml/2006/picture">
-            <wp:extent cx="5400000" cy="3240000"/>
-            <wp:docPr id="3" name="Picture 3"/>
-            <wp:cNvGraphicFramePr>
-              <a:graphicFrameLocks noChangeAspect="1"/>
-            </wp:cNvGraphicFramePr>
-            <a:graphic>
-              <a:graphicData uri="http://schemas.openxmlformats.org/drawingml/2006/picture">
-                <pic:pic>
-                  <pic:nvPicPr>
-                    <pic:cNvPr id="0" name="extra_power_of_two.png"/>
-                    <pic:cNvPicPr/>
-                  </pic:nvPicPr>
-                  <pic:blipFill>
-                    <a:blip r:embed="rId11"/>
-                    <a:stretch>
-                      <a:fillRect/>
-                    </a:stretch>
-                  </pic:blipFill>
-                  <pic:spPr>
-                    <a:xfrm>
-                      <a:off x="0" y="0"/>
-                      <a:ext cx="5400000" cy="3240000"/>
-                    </a:xfrm>
-                    <a:prstGeom prst="rect"/>
-                  </pic:spPr>
-                </pic:pic>
-              </a:graphicData>
-            </a:graphic>
-          </wp:inline>
-        </w:drawing>
-      </w:r>
-    </w:p>
-    <w:p>
-      <w:pPr>
-        <w:jc w:val="center"/>
-      </w:pPr>
-      <w:r>
-        <w:rPr>
-          <w:i/>
-          <w:sz w:val="18"/>
-        </w:rPr>
-        <w:t>Figure 3. Dark bars: power-of-two sizes. Light bars: the neighbours n - 1 and n + 1.</w:t>
-      </w:r>
-    </w:p>
-    <w:p>
-      <w:pPr>
-        <w:pStyle w:val="Heading2"/>
-      </w:pPr>
-      <w:r>
-        <w:t>4.4 Memory</w:t>
-      </w:r>
-    </w:p>
-    <w:p>
-      <w:pPr>
-        <w:jc w:val="center"/>
-      </w:pPr>
-      <w:r>
-        <w:drawing>
-          <wp:inline xmlns:a="http://schemas.openxmlformats.org/drawingml/2006/main" xmlns:pic="http://schemas.openxmlformats.org/drawingml/2006/picture">
-            <wp:extent cx="5400000" cy="3471429"/>
-            <wp:docPr id="4" name="Picture 4"/>
-            <wp:cNvGraphicFramePr>
-              <a:graphicFrameLocks noChangeAspect="1"/>
-            </wp:cNvGraphicFramePr>
-            <a:graphic>
-              <a:graphicData uri="http://schemas.openxmlformats.org/drawingml/2006/picture">
-                <pic:pic>
-                  <pic:nvPicPr>
-                    <pic:cNvPr id="0" name="memory.png"/>
-                    <pic:cNvPicPr/>
-                  </pic:nvPicPr>
-                  <pic:blipFill>
-                    <a:blip r:embed="rId12"/>
-                    <a:stretch>
-                      <a:fillRect/>
-                    </a:stretch>
-                  </pic:blipFill>
-                  <pic:spPr>
-                    <a:xfrm>
-                      <a:off x="0" y="0"/>
-                      <a:ext cx="5400000" cy="3471429"/>
-                    </a:xfrm>
-                    <a:prstGeom prst="rect"/>
-                  </pic:spPr>
-                </pic:pic>
-              </a:graphicData>
-            </a:graphic>
-          </wp:inline>
-        </w:drawing>
-      </w:r>
-    </w:p>
-    <w:p>
-      <w:pPr>
-        <w:jc w:val="center"/>
-      </w:pPr>
-      <w:r>
-        <w:rPr>
-          <w:i/>
-          <w:sz w:val="18"/>
-        </w:rPr>
-        <w:t>Figure 4. Peak memory of the benchmark process vs n. The dashed line is the size of A, B and C as doubles.</w:t>
+        <w:t xml:space="preserve"> C stays close to the size of the data (100 MiB for 96 MiB at n = 2048). Java starts at about 45 MiB for the JVM itself and reaches 361 MiB, because each run creates a new result and the garbage collector frees old ones later. Python uses 135 MiB for 24 MiB of data at n = 1024: each number is an object (24 bytes) plus a pointer (8 bytes), about 4 times more than C.</w:t>
       </w:r>
     </w:p>
     <w:p>
@@ -6023,15 +3526,7 @@
         <w:pStyle w:val="Heading1"/>
       </w:pPr>
       <w:r>
-        <w:t>5. Discussion</w:t>
-      </w:r>
-    </w:p>
-    <w:p>
-      <w:pPr>
-        <w:pStyle w:val="Heading2"/>
-      </w:pPr>
-      <w:r>
-        <w:t>5.1 Growth with n (H1)</w:t>
+        <w:t>3. Conclusions and future work</w:t>
       </w:r>
     </w:p>
     <w:p>
@@ -6039,71 +3534,7 @@
         <w:spacing w:after="80"/>
       </w:pPr>
       <w:r>
-        <w:t>H1 is supported. Python's time per iteration stays between 71 and 92 ns, so its growth is almost exactly cubic (b = 3.05 from n = 64 to 1024). For C, the fitted b = 3.51 is larger, but this comes from a single jump between n = 256 and n = 512 (Figure 2); from n = 512 to 2048 the C time grows with b = 3.05. Java's cost per iteration grows from 0.7 ns to 3.9 ns at n = 2048, so its fitted b = 3.80 is above 3. The algorithm is O(n³), but the constant (the cost of one iteration) is not fixed: it depends on how well the data fits in the cache.</w:t>
-      </w:r>
-    </w:p>
-    <w:p>
-      <w:pPr>
-        <w:pStyle w:val="Heading2"/>
-      </w:pPr>
-      <w:r>
-        <w:t>5.2 Python vs C and Java (H2)</w:t>
-      </w:r>
-    </w:p>
-    <w:p>
-      <w:pPr>
-        <w:spacing w:after="80"/>
-      </w:pPr>
-      <w:r>
-        <w:t>H2 is supported. Python needed 71-92 ns for each multiply-add, while C and Java needed about 0.6-4.7 ns. At n = 1024 Python was 20 times slower than C and 57 times slower than Java; at n = 1023, where C does not suffer from the cache problem, C needs 0.70 ns, about 130 times less than Python. The reason is the interpreter: for every c[i][j] += a[i][k]·b[k][j] CPython runs several bytecode instructions, looks up list elements, reads float objects through pointers and creates a new float object for the result. C and Java do the same work with a few machine instructions.</w:t>
-      </w:r>
-    </w:p>
-    <w:p>
-      <w:pPr>
-        <w:pStyle w:val="Heading2"/>
-      </w:pPr>
-      <w:r>
-        <w:t>5.3 Why Java was faster than C (H3)</w:t>
-      </w:r>
-    </w:p>
-    <w:p>
-      <w:pPr>
-        <w:spacing w:after="80"/>
-      </w:pPr>
-      <w:r>
-        <w:t>H3 is rejected for the main sizes: Java was faster than C at every n ≥ 128. The extra experiment explains this. In C, the matrix B is one block, so b[k][j] and b[k+1][j] are exactly 8n bytes apart: 4096 bytes when n = 512. On our CPU, addresses that are 4096 bytes apart go to the same L1 set, which only holds 8 lines [9]. The inner loop reads a full column of B, so almost all of its 512 lines compete for 8 places and have to be read again from slower memory every time. The L2 cache has the same problem at a smaller scale. At n = 511 or 513 the distance is not a power of two, the column is spread over many sets, and C becomes 6-7 times faster (0.64-0.75 ns instead of 4.64 ns). In Java, every row is a separate object with a small header, so the distance between rows is not exactly a power of two and the problem mostly disappears. At sizes that are not powers of two, C was faster than Java (Table 8).</w:t>
-      </w:r>
-    </w:p>
-    <w:p>
-      <w:pPr>
-        <w:spacing w:after="80"/>
-      </w:pPr>
-      <w:r>
-        <w:t>We also checked the machine code that gcc produced (gcc -O2 -S): the inner loop keeps c[i][j] in a register and only does a load, a multiply and an add, so the slowdown does not come from extra instructions in C.</w:t>
-      </w:r>
-    </w:p>
-    <w:p>
-      <w:pPr>
-        <w:pStyle w:val="Heading2"/>
-      </w:pPr>
-      <w:r>
-        <w:t>5.4 Memory (H4)</w:t>
-      </w:r>
-    </w:p>
-    <w:p>
-      <w:pPr>
-        <w:spacing w:after="80"/>
-      </w:pPr>
-      <w:r>
-        <w:t>H4 is supported. For C, the peak memory is close to the three matrices at large n (100.4 MiB vs 96 MiB at n = 2048). Java starts at about 45 MiB with tiny matrices, which is the JVM itself, and reaches 361.5 MiB at n = 2048, because each run creates a new result matrix and the garbage collector frees old ones only from time to time. Python used 135.5 MiB at n = 1024, more than 5 times the 24 MiB of data: each number is a float object (24 bytes) plus a pointer in the list (8 bytes), so 32 bytes instead of 8.</w:t>
-      </w:r>
-    </w:p>
-    <w:p>
-      <w:pPr>
-        <w:pStyle w:val="Heading2"/>
-      </w:pPr>
-      <w:r>
-        <w:t>5.5 Limitations</w:t>
+        <w:t>On this machine and with these settings:</w:t>
       </w:r>
     </w:p>
     <w:p>
@@ -6112,7 +3543,7 @@
         <w:spacing w:after="80"/>
       </w:pPr>
       <w:r>
-        <w:t>One machine, one operating system and one setting per language; other CPUs have other cache sizes.</w:t>
+        <w:t>The basic algorithm grows like n³ in the three languages, but the cost of one operation is not fixed: it depends on how the data uses the cache.</w:t>
       </w:r>
     </w:p>
     <w:p>
@@ -6121,7 +3552,7 @@
         <w:spacing w:after="80"/>
       </w:pPr>
       <w:r>
-        <w:t>Only 5 measured runs per configuration. The IQR was small (below 3% of the median in 11 of 17 configurations, at most 12%), so the conclusions do not depend on one run.</w:t>
+        <w:t>Python is 18-190 times slower than C; its largest size within the budget is n = 1024.</w:t>
       </w:r>
     </w:p>
     <w:p>
@@ -6130,7 +3561,7 @@
         <w:spacing w:after="80"/>
       </w:pPr>
       <w:r>
-        <w:t>Memory is sampled every 10 ms. For very short runs (C with n ≤ 128) the process can end between two samples, so those values may be too low. Peak memory of different runtimes includes very different things (JVM, interpreter), so it is not only the cost of the matrices.</w:t>
+        <w:t>Java beat C only at power-of-two sizes, because of cache conflicts in C's memory layout. At n ± 1, C is the fastest. One language is not “always faster”: the data layout matters as much.</w:t>
       </w:r>
     </w:p>
     <w:p>
@@ -6139,16 +3570,35 @@
         <w:spacing w:after="80"/>
       </w:pPr>
       <w:r>
-        <w:t>Windows can run background tasks during measurements; we closed heavy programs but could not control everything.</w:t>
+        <w:t>C uses about the memory of the data; Java adds the JVM and garbage; Python needs about 4 times more memory per number.</w:t>
       </w:r>
     </w:p>
     <w:p>
       <w:pPr>
-        <w:pStyle w:val="ListBullet"/>
         <w:spacing w:after="80"/>
       </w:pPr>
       <w:r>
-        <w:t>We did not test why Java becomes slower at n = 2048 (3.9 ns per iteration). Possible reasons are partial cache conflicts or TLB misses (the column touches 2048 different memory pages).</w:t>
+        <w:rPr>
+          <w:b/>
+        </w:rPr>
+        <w:t>Limitations:</w:t>
+      </w:r>
+      <w:r>
+        <w:t xml:space="preserve"> one computer, 5 runs per configuration (IQR below 3% of the median in most cases, at most 12%), and memory sampled every 10 ms, so very short runs may be underestimated.</w:t>
+      </w:r>
+    </w:p>
+    <w:p>
+      <w:pPr>
+        <w:spacing w:after="80"/>
+      </w:pPr>
+      <w:r>
+        <w:rPr>
+          <w:b/>
+        </w:rPr>
+        <w:t>Future work (next assignments):</w:t>
+      </w:r>
+      <w:r>
+        <w:t xml:space="preserve"> the cache problem comes from reading B by columns. Changing only the loop order to i-k-j makes all accesses sequential, which the course notes show can be up to 6 times faster at n = 1024 [5]. Blocking (tiling) should reuse the cache even better, and sparse formats such as CRS should save time and memory when most values are zero [5]. After that, the work can be split across cores (Assignment 3) and machines (Assignment 4).</w:t>
       </w:r>
     </w:p>
     <w:p>
@@ -6156,7 +3606,7 @@
         <w:pStyle w:val="Heading1"/>
       </w:pPr>
       <w:r>
-        <w:t>6. Conclusions</w:t>
+        <w:t>References and materials</w:t>
       </w:r>
     </w:p>
     <w:p>
@@ -6164,23 +3614,7 @@
         <w:spacing w:after="80"/>
       </w:pPr>
       <w:r>
-        <w:t>On this machine and with these settings: (1) the basic algorithm grows close to n³ in the three languages, but the cost per iteration changes with the size because of the cache; (2) Python is 18-190 times slower than C and its largest feasible size within the budget is n = 1024; (3) at power-of-two sizes Java is faster than C, but this is caused by cache conflicts in C's memory layout and not by the language itself: at n ± 1 C is the fastest; (4) C uses about the memory of the data, Java adds the JVM and garbage, and Python needs about 4 times more memory per number. Open questions for the next assignments: changing the loop order (i-k-j) or using blocks should remove the column access problem.</w:t>
-      </w:r>
-    </w:p>
-    <w:p>
-      <w:pPr>
-        <w:pStyle w:val="Heading1"/>
-      </w:pPr>
-      <w:r>
-        <w:t>7. References and materials</w:t>
-      </w:r>
-    </w:p>
-    <w:p>
-      <w:pPr>
-        <w:spacing w:after="80"/>
-      </w:pPr>
-      <w:r>
-        <w:t>[1] T. H. Cormen, C. E. Leiserson, R. L. Rivest and C. Stein, Introduction to Algorithms, 4th ed. Cambridge, MA, USA: MIT Press, 2022.</w:t>
+        <w:t>[1] T. H. Cormen, C. E. Leiserson, R. L. Rivest and C. Stein, Introduction to Algorithms, 4th ed. MIT Press, 2022.</w:t>
       </w:r>
     </w:p>
     <w:p>
@@ -6196,7 +3630,7 @@
         <w:spacing w:after="80"/>
       </w:pPr>
       <w:r>
-        <w:t>[3] J. L. Hennessy and D. A. Patterson, Computer Architecture: A Quantitative Approach, 6th ed. Cambridge, MA, USA: Morgan Kaufmann, 2017.</w:t>
+        <w:t>[3] J. L. Hennessy and D. A. Patterson, Computer Architecture: A Quantitative Approach, 6th ed. Morgan Kaufmann, 2017.</w:t>
       </w:r>
     </w:p>
     <w:p>
@@ -6204,7 +3638,7 @@
         <w:spacing w:after="80"/>
       </w:pPr>
       <w:r>
-        <w:t>[4] A. Georges, D. Buytaert and L. Eeckhout, “Statistically rigorous Java performance evaluation,” in Proc. OOPSLA, 2007, pp. 57-76.</w:t>
+        <w:t>[4] AMD, “Software Optimization Guide for AMD Family 19h Processors,” pub. 56665, 2020.</w:t>
       </w:r>
     </w:p>
     <w:p>
@@ -6212,39 +3646,7 @@
         <w:spacing w:after="80"/>
       </w:pPr>
       <w:r>
-        <w:t>[5] Python Software Foundation, “time: Time access and conversions,” Python 3 documentation. https://docs.python.org/3/library/time.html</w:t>
-      </w:r>
-    </w:p>
-    <w:p>
-      <w:pPr>
-        <w:spacing w:after="80"/>
-      </w:pPr>
-      <w:r>
-        <w:t>[6] Oracle, “Class System,” Java SE 25 API documentation. https://docs.oracle.com/en/java/javase/25/docs/api/java.base/java/lang/System.html</w:t>
-      </w:r>
-    </w:p>
-    <w:p>
-      <w:pPr>
-        <w:spacing w:after="80"/>
-      </w:pPr>
-      <w:r>
-        <w:t>[7] G. Rodola, “psutil documentation.” https://psutil.readthedocs.io</w:t>
-      </w:r>
-    </w:p>
-    <w:p>
-      <w:pPr>
-        <w:spacing w:after="80"/>
-      </w:pPr>
-      <w:r>
-        <w:t>[8] NumPy Developers, “Random Generator,” NumPy documentation. https://numpy.org/doc/stable/reference/random/generator.html</w:t>
-      </w:r>
-    </w:p>
-    <w:p>
-      <w:pPr>
-        <w:spacing w:after="80"/>
-      </w:pPr>
-      <w:r>
-        <w:t>[9] AMD, “Software Optimization Guide for AMD Family 19h Processors,” pub. 56665, 2020.</w:t>
+        <w:t>[5] Big Data course notes, “Experiments: Monitoring and Performance Engineering,” Grado en Ciencia e Ingeniería de Datos, 2026.</w:t>
       </w:r>
     </w:p>
     <w:p>
@@ -6258,7 +3660,7 @@
         <w:t>Materials.</w:t>
       </w:r>
       <w:r>
-        <w:t xml:space="preserve"> Everything is in https://github.com/Pablo5250/matrix-multiplication, folder assignment1/: source code, config.json, README.md with exact commands (run_all.bat does the whole study), raw results (results/raw/times.csv, runs.csv), summary tables, analysis scripts and figures. The input matrices are not stored; data/generate_inputs.py recreates them and data/manifest.json lets you check that they are identical (SHA-256).</w:t>
+        <w:t xml:space="preserve"> https://github.com/Pablo5250/matrix-multiplication, folder assignment1/: source code, config.json, README.md with the exact commands (run_all.bat repeats the whole study), raw measurements (results/raw/times.csv), summary tables, analysis scripts and figures. The input matrices are recreated by data/generate_inputs.py and checked with SHA-256 (data/manifest.json).</w:t>
       </w:r>
     </w:p>
     <w:p>

</xml_diff>

<commit_message>
Report: tolerance justification, no-timeout note and more careful wording
</commit_message>
<xml_diff>
--- a/assignment1/report/Assignment01_CastilloGarcera_Report.docx
+++ b/assignment1/report/Assignment01_CastilloGarcera_Report.docx
@@ -156,7 +156,7 @@
         <w:t>Correct before fast:</w:t>
       </w:r>
       <w:r>
-        <w:t xml:space="preserve"> unit tests (2×2 and 3×3 by hand, A × I = A, A × 0 = 0) and a comparison with NumPy for n = 16, 64, 128 (relative tolerance 10⁻⁹). All passed, and the three languages gave bit-identical results.</w:t>
+        <w:t xml:space="preserve"> unit tests (2×2 and 3×3 by hand, A × I = A, A × 0 = 0) and a comparison with NumPy for n = 16, 64, 128 (relative tolerance 10⁻⁹, absolute 10⁻¹²: the expected rounding error is about n × 1.1×10⁻¹⁶, below 10⁻¹³ here, so this margin still catches any real bug). All passed, and the three languages gave bit-identical results.</w:t>
       </w:r>
     </w:p>
     <w:p>
@@ -641,7 +641,7 @@
         <w:spacing w:after="80"/>
       </w:pPr>
       <w:r>
-        <w:t xml:space="preserve">All lines are almost parallel to the n³ line, so </w:t>
+        <w:t xml:space="preserve">All lines grow roughly like the n³ line, so </w:t>
       </w:r>
       <w:r>
         <w:rPr>
@@ -650,7 +650,7 @@
         <w:t>H1 holds</w:t>
       </w:r>
       <w:r>
-        <w:t xml:space="preserve">. Python is far above the others: 18 to 190 times slower than C (99 s at n = 1024). Python at n = 2048 was skipped, because the predicted time (about 4,700 s) was over the budget. </w:t>
+        <w:t xml:space="preserve">, although C and Java become a few times slower per operation at large n (Table 2), because of the cache effect explained below. Python is far above the others: 18 to 190 times slower than C (99 s at n = 1024). Python at n = 2048 was skipped, because the predicted time (about 4,700 s) was over the budget; there were no timeouts or memory failures. </w:t>
       </w:r>
       <w:r>
         <w:rPr>
@@ -3444,7 +3444,7 @@
         <w:t>In C, n = 512 and 1024 are 6-7 times slower than their neighbours</w:t>
       </w:r>
       <w:r>
-        <w:t xml:space="preserve"> (4.6 ns vs 0.6-0.8 ns per iteration); Java hardly changes, and at the neighbour sizes C is the fastest. The cause is </w:t>
+        <w:t xml:space="preserve"> (4.6 ns vs 0.6-0.8 ns per iteration); Java hardly changes, and at the neighbour sizes C is the fastest. The most likely cause is </w:t>
       </w:r>
       <w:r>
         <w:rPr>
@@ -3453,7 +3453,7 @@
         <w:t>data locality</w:t>
       </w:r>
       <w:r>
-        <w:t xml:space="preserve"> [2], [3]: the inner loop reads a column of B. In C the rows are one block, so b[k][j] and b[k+1][j] are exactly 8n bytes apart (4096 bytes at n = 512). On this CPU those addresses all go to the same cache set, which holds only 8 lines [4], so the column is read again from slower memory every time (conflict misses). In Java each row is a separate object with a header, the distance is not a power of two, and the problem mostly disappears. It is not a bug: the code is correct and validated; it is the basic algorithm meeting the cache.</w:t>
+        <w:t xml:space="preserve"> [2], [3]: the inner loop reads a column of B. In C the rows are one block, so b[k][j] and b[k+1][j] are exactly 8n bytes apart (4096 bytes at n = 512). On this CPU those addresses all go to the same cache set, which holds only 8 lines [4], so the column has to be read again from slower memory every time (conflict misses). In Java each row is a separate object with a header, the distance is not a power of two, and the problem mostly disappears. We did not count cache misses directly, but the n ± 1 results fit this explanation. The code is correct; the slowdown comes from the basic algorithm and the memory layout.</w:t>
       </w:r>
     </w:p>
     <w:p>
@@ -3518,7 +3518,7 @@
         <w:t>H4 holds.</w:t>
       </w:r>
       <w:r>
-        <w:t xml:space="preserve"> C stays close to the size of the data (100 MiB for 96 MiB at n = 2048). Java starts at about 45 MiB for the JVM itself and reaches 361 MiB, because each run creates a new result and the garbage collector frees old ones later. Python uses 135 MiB for 24 MiB of data at n = 1024: each number is an object (24 bytes) plus a pointer (8 bytes), about 4 times more than C.</w:t>
+        <w:t xml:space="preserve"> C stays close to the size of the data (100 MiB for 96 MiB at n = 2048). Java starts at about 45 MiB for the JVM itself and reaches 361 MiB, probably because each run creates a new result and the garbage collector frees old ones later. Python uses 135 MiB for 24 MiB of data at n = 1024: each number is an object (24 bytes) plus a pointer (8 bytes), about 4 times more than C.</w:t>
       </w:r>
     </w:p>
     <w:p>
@@ -3584,7 +3584,7 @@
         <w:t>Limitations:</w:t>
       </w:r>
       <w:r>
-        <w:t xml:space="preserve"> one computer, 5 runs per configuration (IQR below 3% of the median in most cases, at most 12%), and memory sampled every 10 ms, so very short runs may be underestimated.</w:t>
+        <w:t xml:space="preserve"> one computer, 5 runs per configuration (IQR below 3% of the median in most cases, at most 12%), memory sampled every 10 ms (very short runs may be underestimated), and no hardware counters to measure cache misses directly.</w:t>
       </w:r>
     </w:p>
     <w:p>

</xml_diff>